<commit_message>
fix P11 50 53 print style
</commit_message>
<xml_diff>
--- a/tools/candidates/portfolio-owner-pdf-20261013/13-raschet-metrami/50-slovar-poley-raschet-metrami.docx
+++ b/tools/candidates/portfolio-owner-pdf-20261013/13-raschet-metrami/50-slovar-poley-raschet-metrami.docx
@@ -5,13 +5,15 @@
     <w:p>
       <w:pPr>
         <w:pStyle w:val="Heading1"/>
-        <w:spacing w:after="200" w:before="240"/>
+        <w:spacing w:after="60" w:before="0"/>
       </w:pPr>
       <w:r>
         <w:rPr>
           <w:rFonts w:ascii="Times New Roman" w:cs="Times New Roman" w:eastAsia="Times New Roman" w:hAnsi="Times New Roman"/>
           <w:b/>
           <w:bCs/>
+          <w:i w:val="0"/>
+          <w:color w:val="323539"/>
           <w:sz w:val="32"/>
           <w:szCs w:val="32"/>
         </w:rPr>
@@ -20,14 +22,14 @@
     </w:p>
     <w:p>
       <w:pPr>
-        <w:spacing w:after="120" w:line="276"/>
+        <w:spacing w:after="60" w:line="276" w:before="0"/>
       </w:pPr>
       <w:r>
         <w:rPr>
           <w:rFonts w:ascii="Times New Roman" w:cs="Times New Roman" w:eastAsia="Times New Roman" w:hAnsi="Times New Roman"/>
-          <w:i/>
+          <w:i w:val="0"/>
           <w:iCs/>
-          <w:color w:val="595959"/>
+          <w:color w:val="323539"/>
           <w:sz w:val="24"/>
           <w:szCs w:val="24"/>
         </w:rPr>
@@ -63,14 +65,18 @@
           </w:tcPr>
           <w:p>
             <w:pPr>
-              <w:spacing w:after="100" w:line="276"/>
-            </w:pPr>
-            <w:r>
-              <w:rPr>
-                <w:rFonts w:ascii="Times New Roman" w:cs="Times New Roman" w:eastAsia="Times New Roman" w:hAnsi="Times New Roman"/>
-                <w:b/>
-                <w:bCs/>
-                <w:sz w:val="24"/>
+              <w:keepNext w:val="0"/>
+              <w:keepLines w:val="0"/>
+              <w:spacing w:after="20" w:line="276" w:before="0"/>
+            </w:pPr>
+            <w:r>
+              <w:rPr>
+                <w:rFonts w:ascii="Times New Roman" w:cs="Times New Roman" w:eastAsia="Times New Roman" w:hAnsi="Times New Roman"/>
+                <w:b/>
+                <w:bCs/>
+                <w:i w:val="0"/>
+                <w:color w:val="323539"/>
+                <w:sz w:val="16"/>
                 <w:szCs w:val="24"/>
               </w:rPr>
               <w:t xml:space="preserve">Важно, прочитайте до использования</w:t>
@@ -78,12 +84,16 @@
           </w:p>
           <w:p>
             <w:pPr>
-              <w:spacing w:after="100" w:line="276"/>
-            </w:pPr>
-            <w:r>
-              <w:rPr>
-                <w:rFonts w:ascii="Times New Roman" w:cs="Times New Roman" w:eastAsia="Times New Roman" w:hAnsi="Times New Roman"/>
-                <w:sz w:val="24"/>
+              <w:keepNext w:val="0"/>
+              <w:keepLines w:val="0"/>
+              <w:spacing w:after="20" w:line="276" w:before="0"/>
+            </w:pPr>
+            <w:r>
+              <w:rPr>
+                <w:rFonts w:ascii="Times New Roman" w:cs="Times New Roman" w:eastAsia="Times New Roman" w:hAnsi="Times New Roman"/>
+                <w:i w:val="0"/>
+                <w:color w:val="323539"/>
+                <w:sz w:val="16"/>
                 <w:szCs w:val="24"/>
               </w:rPr>
               <w:t>Комплект помогает проверить предложение о расчёте квартирами, запросить подтверждающие документы и сопоставить оплаченное право с обязательствами по ДДУ. Решение о сделке принимается по проверенным фактам и документам конкретного объекта.</w:t>
@@ -91,12 +101,16 @@
           </w:p>
           <w:p>
             <w:pPr>
-              <w:spacing w:after="100" w:line="276"/>
-            </w:pPr>
-            <w:r>
-              <w:rPr>
-                <w:rFonts w:ascii="Times New Roman" w:cs="Times New Roman" w:eastAsia="Times New Roman" w:hAnsi="Times New Roman"/>
-                <w:sz w:val="24"/>
+              <w:keepNext w:val="0"/>
+              <w:keepLines w:val="0"/>
+              <w:spacing w:after="20" w:line="276" w:before="0"/>
+            </w:pPr>
+            <w:r>
+              <w:rPr>
+                <w:rFonts w:ascii="Times New Roman" w:cs="Times New Roman" w:eastAsia="Times New Roman" w:hAnsi="Times New Roman"/>
+                <w:i w:val="0"/>
+                <w:color w:val="323539"/>
+                <w:sz w:val="16"/>
                 <w:szCs w:val="24"/>
               </w:rPr>
               <w:t>До подписания сопоставьте условия ДДУ, уступки и документы банка с ч. 3 ст. 15.4 и ст. 11 Закона № 214-ФЗ, а при переводе долга — с п. 2 ст. 391 ГК РФ.</w:t>
@@ -104,12 +118,16 @@
           </w:p>
           <w:p>
             <w:pPr>
-              <w:spacing w:after="100" w:line="276"/>
-            </w:pPr>
-            <w:r>
-              <w:rPr>
-                <w:rFonts w:ascii="Times New Roman" w:cs="Times New Roman" w:eastAsia="Times New Roman" w:hAnsi="Times New Roman"/>
-                <w:sz w:val="24"/>
+              <w:keepNext w:val="0"/>
+              <w:keepLines w:val="0"/>
+              <w:spacing w:after="20" w:line="276" w:before="0"/>
+            </w:pPr>
+            <w:r>
+              <w:rPr>
+                <w:rFonts w:ascii="Times New Roman" w:cs="Times New Roman" w:eastAsia="Times New Roman" w:hAnsi="Times New Roman"/>
+                <w:i w:val="0"/>
+                <w:color w:val="323539"/>
+                <w:sz w:val="16"/>
                 <w:szCs w:val="24"/>
               </w:rPr>
               <w:t xml:space="preserve">Граница проходит по стадии. Пока сделка обсуждается и бумаги не подписаны — комплект работает. Уступка уже подписана и идёт спор — дальше работа юриста по конкретным документам. Застройщик в процедуре банкротства — это комплект «Реестр требований кредиторов» и юрист, а не эти файлы.</w:t>
@@ -117,12 +135,16 @@
           </w:p>
           <w:p>
             <w:pPr>
-              <w:spacing w:after="0" w:line="276"/>
-            </w:pPr>
-            <w:r>
-              <w:rPr>
-                <w:rFonts w:ascii="Times New Roman" w:cs="Times New Roman" w:eastAsia="Times New Roman" w:hAnsi="Times New Roman"/>
-                <w:sz w:val="24"/>
+              <w:keepNext w:val="0"/>
+              <w:keepLines w:val="0"/>
+              <w:spacing w:after="20" w:line="276" w:before="0"/>
+            </w:pPr>
+            <w:r>
+              <w:rPr>
+                <w:rFonts w:ascii="Times New Roman" w:cs="Times New Roman" w:eastAsia="Times New Roman" w:hAnsi="Times New Roman"/>
+                <w:i w:val="0"/>
+                <w:color w:val="323539"/>
+                <w:sz w:val="16"/>
                 <w:szCs w:val="24"/>
               </w:rPr>
               <w:t>При неполном пополнении эскроу отдельно проверьте, кто обязан внести недостающую сумму, условия одновременного перевода долга и согласие кредитора. Подтверждение расчётов между сторонами не означает поступления средств на счёт эскроу.</w:t>
@@ -133,20 +155,22 @@
     </w:tbl>
     <w:p>
       <w:pPr>
-        <w:spacing w:after="120" w:line="276"/>
+        <w:spacing w:after="60" w:line="276" w:before="0"/>
       </w:pPr>
     </w:p>
     <w:p>
       <w:pPr>
         <w:pStyle w:val="Heading2"/>
         <w:keepNext/>
-        <w:spacing w:after="120" w:before="260"/>
+        <w:spacing w:after="60" w:before="0"/>
       </w:pPr>
       <w:r>
         <w:rPr>
           <w:rFonts w:ascii="Times New Roman" w:cs="Times New Roman" w:eastAsia="Times New Roman" w:hAnsi="Times New Roman"/>
           <w:b/>
           <w:bCs/>
+          <w:i w:val="0"/>
+          <w:color w:val="323539"/>
           <w:sz w:val="26"/>
           <w:szCs w:val="26"/>
         </w:rPr>
@@ -160,11 +184,13 @@
           <w:ilvl w:val="0"/>
           <w:numId w:val="2"/>
         </w:numPr>
-        <w:spacing w:after="80" w:line="276"/>
+        <w:spacing w:after="60" w:line="276" w:before="0"/>
       </w:pPr>
       <w:r>
         <w:rPr>
           <w:rFonts w:ascii="Times New Roman" w:cs="Times New Roman" w:eastAsia="Times New Roman" w:hAnsi="Times New Roman"/>
+          <w:i w:val="0"/>
+          <w:color w:val="323539"/>
           <w:sz w:val="24"/>
           <w:szCs w:val="24"/>
         </w:rPr>
@@ -178,11 +204,13 @@
           <w:ilvl w:val="0"/>
           <w:numId w:val="2"/>
         </w:numPr>
-        <w:spacing w:after="80" w:line="276"/>
+        <w:spacing w:after="60" w:line="276" w:before="0"/>
       </w:pPr>
       <w:r>
         <w:rPr>
           <w:rFonts w:ascii="Times New Roman" w:cs="Times New Roman" w:eastAsia="Times New Roman" w:hAnsi="Times New Roman"/>
+          <w:i w:val="0"/>
+          <w:color w:val="323539"/>
           <w:sz w:val="24"/>
           <w:szCs w:val="24"/>
         </w:rPr>
@@ -196,11 +224,13 @@
           <w:ilvl w:val="0"/>
           <w:numId w:val="2"/>
         </w:numPr>
-        <w:spacing w:after="80" w:line="276"/>
+        <w:spacing w:after="60" w:line="276" w:before="0"/>
       </w:pPr>
       <w:r>
         <w:rPr>
           <w:rFonts w:ascii="Times New Roman" w:cs="Times New Roman" w:eastAsia="Times New Roman" w:hAnsi="Times New Roman"/>
+          <w:i w:val="0"/>
+          <w:color w:val="323539"/>
           <w:sz w:val="24"/>
           <w:szCs w:val="24"/>
         </w:rPr>
@@ -211,13 +241,15 @@
       <w:pPr>
         <w:pStyle w:val="Heading2"/>
         <w:keepNext/>
-        <w:spacing w:after="120" w:before="260"/>
+        <w:spacing w:after="60" w:before="0"/>
       </w:pPr>
       <w:r>
         <w:rPr>
           <w:rFonts w:ascii="Times New Roman" w:cs="Times New Roman" w:eastAsia="Times New Roman" w:hAnsi="Times New Roman"/>
           <w:b/>
           <w:bCs/>
+          <w:i w:val="0"/>
+          <w:color w:val="323539"/>
           <w:sz w:val="26"/>
           <w:szCs w:val="26"/>
         </w:rPr>
@@ -235,11 +267,12 @@
           <w:insideH w:val="single" w:color="auto" w:sz="4"/>
           <w:insideV w:val="single" w:color="auto" w:sz="4"/>
         </w:tblBorders>
+        <w:tblLayout w:type="fixed"/>
       </w:tblPr>
       <w:tblGrid>
-        <w:gridCol w:w="3200"/>
-        <w:gridCol w:w="3300"/>
-        <w:gridCol w:w="2860"/>
+        <w:gridCol w:w="3798"/>
+        <w:gridCol w:w="3458"/>
+        <w:gridCol w:w="2551"/>
       </w:tblGrid>
       <w:tr>
         <w:trPr>
@@ -258,14 +291,18 @@
           </w:tcPr>
           <w:p>
             <w:pPr>
-              <w:spacing w:after="0" w:line="240"/>
-            </w:pPr>
-            <w:r>
-              <w:rPr>
-                <w:rFonts w:ascii="Times New Roman" w:cs="Times New Roman" w:eastAsia="Times New Roman" w:hAnsi="Times New Roman"/>
-                <w:b/>
-                <w:bCs/>
-                <w:sz w:val="22"/>
+              <w:keepNext w:val="0"/>
+              <w:keepLines w:val="0"/>
+              <w:spacing w:after="20" w:line="240" w:before="0"/>
+            </w:pPr>
+            <w:r>
+              <w:rPr>
+                <w:rFonts w:ascii="Times New Roman" w:cs="Times New Roman" w:eastAsia="Times New Roman" w:hAnsi="Times New Roman"/>
+                <w:b/>
+                <w:bCs/>
+                <w:i w:val="0"/>
+                <w:color w:val="323539"/>
+                <w:sz w:val="16"/>
                 <w:szCs w:val="22"/>
               </w:rPr>
               <w:t xml:space="preserve">Поле</w:t>
@@ -285,14 +322,18 @@
           </w:tcPr>
           <w:p>
             <w:pPr>
-              <w:spacing w:after="0" w:line="240"/>
-            </w:pPr>
-            <w:r>
-              <w:rPr>
-                <w:rFonts w:ascii="Times New Roman" w:cs="Times New Roman" w:eastAsia="Times New Roman" w:hAnsi="Times New Roman"/>
-                <w:b/>
-                <w:bCs/>
-                <w:sz w:val="22"/>
+              <w:keepNext w:val="0"/>
+              <w:keepLines w:val="0"/>
+              <w:spacing w:after="20" w:line="240" w:before="0"/>
+            </w:pPr>
+            <w:r>
+              <w:rPr>
+                <w:rFonts w:ascii="Times New Roman" w:cs="Times New Roman" w:eastAsia="Times New Roman" w:hAnsi="Times New Roman"/>
+                <w:b/>
+                <w:bCs/>
+                <w:i w:val="0"/>
+                <w:color w:val="323539"/>
+                <w:sz w:val="16"/>
                 <w:szCs w:val="22"/>
               </w:rPr>
               <w:t xml:space="preserve">Что вписать</w:t>
@@ -312,14 +353,18 @@
           </w:tcPr>
           <w:p>
             <w:pPr>
-              <w:spacing w:after="0" w:line="240"/>
-            </w:pPr>
-            <w:r>
-              <w:rPr>
-                <w:rFonts w:ascii="Times New Roman" w:cs="Times New Roman" w:eastAsia="Times New Roman" w:hAnsi="Times New Roman"/>
-                <w:b/>
-                <w:bCs/>
-                <w:sz w:val="22"/>
+              <w:keepNext w:val="0"/>
+              <w:keepLines w:val="0"/>
+              <w:spacing w:after="20" w:line="240" w:before="0"/>
+            </w:pPr>
+            <w:r>
+              <w:rPr>
+                <w:rFonts w:ascii="Times New Roman" w:cs="Times New Roman" w:eastAsia="Times New Roman" w:hAnsi="Times New Roman"/>
+                <w:b/>
+                <w:bCs/>
+                <w:i w:val="0"/>
+                <w:color w:val="323539"/>
+                <w:sz w:val="16"/>
                 <w:szCs w:val="22"/>
               </w:rPr>
               <w:t xml:space="preserve">Откуда взять</w:t>
@@ -340,17 +385,19 @@
           </w:tcPr>
           <w:p>
             <w:pPr>
-              <w:spacing w:after="0" w:line="240"/>
-            </w:pPr>
-            <w:r>
-              <w:rPr>
-                <w:rFonts w:ascii="Times New Roman" w:cs="Times New Roman" w:eastAsia="Times New Roman" w:hAnsi="Times New Roman"/>
-                <w:b/>
-                <w:bCs/>
-                <w:i w:val="false"/>
+              <w:keepNext w:val="0"/>
+              <w:keepLines w:val="0"/>
+              <w:spacing w:after="20" w:line="240" w:before="0"/>
+            </w:pPr>
+            <w:r>
+              <w:rPr>
+                <w:rFonts w:ascii="Times New Roman" w:cs="Times New Roman" w:eastAsia="Times New Roman" w:hAnsi="Times New Roman"/>
+                <w:b/>
+                <w:bCs/>
+                <w:i w:val="0"/>
                 <w:iCs w:val="false"/>
-                <w:color w:val="000000"/>
-                <w:sz w:val="22"/>
+                <w:color w:val="323539"/>
+                <w:sz w:val="16"/>
                 <w:szCs w:val="22"/>
               </w:rPr>
               <w:t xml:space="preserve">{{НАИМЕНОВАНИЕ_ПОДРЯДЧИКА}}</w:t>
@@ -369,14 +416,18 @@
           </w:tcPr>
           <w:p>
             <w:pPr>
-              <w:spacing w:after="0" w:line="240"/>
-            </w:pPr>
-            <w:r>
-              <w:rPr>
-                <w:rFonts w:ascii="Times New Roman" w:cs="Times New Roman" w:eastAsia="Times New Roman" w:hAnsi="Times New Roman"/>
-                <w:b w:val="false"/>
-                <w:bCs w:val="false"/>
-                <w:sz w:val="22"/>
+              <w:keepNext w:val="0"/>
+              <w:keepLines w:val="0"/>
+              <w:spacing w:after="20" w:line="240" w:before="0"/>
+            </w:pPr>
+            <w:r>
+              <w:rPr>
+                <w:rFonts w:ascii="Times New Roman" w:cs="Times New Roman" w:eastAsia="Times New Roman" w:hAnsi="Times New Roman"/>
+                <w:b w:val="false"/>
+                <w:bCs w:val="false"/>
+                <w:i w:val="0"/>
+                <w:color w:val="323539"/>
+                <w:sz w:val="16"/>
                 <w:szCs w:val="22"/>
               </w:rPr>
               <w:t xml:space="preserve">Полное наименование вашей организации</w:t>
@@ -395,14 +446,18 @@
           </w:tcPr>
           <w:p>
             <w:pPr>
-              <w:spacing w:after="0" w:line="240"/>
-            </w:pPr>
-            <w:r>
-              <w:rPr>
-                <w:rFonts w:ascii="Times New Roman" w:cs="Times New Roman" w:eastAsia="Times New Roman" w:hAnsi="Times New Roman"/>
-                <w:b w:val="false"/>
-                <w:bCs w:val="false"/>
-                <w:sz w:val="22"/>
+              <w:keepNext w:val="0"/>
+              <w:keepLines w:val="0"/>
+              <w:spacing w:after="20" w:line="240" w:before="0"/>
+            </w:pPr>
+            <w:r>
+              <w:rPr>
+                <w:rFonts w:ascii="Times New Roman" w:cs="Times New Roman" w:eastAsia="Times New Roman" w:hAnsi="Times New Roman"/>
+                <w:b w:val="false"/>
+                <w:bCs w:val="false"/>
+                <w:i w:val="0"/>
+                <w:color w:val="323539"/>
+                <w:sz w:val="16"/>
                 <w:szCs w:val="22"/>
               </w:rPr>
               <w:t xml:space="preserve">учредительные документы, выписка ЕГРЮЛ</w:t>
@@ -423,17 +478,19 @@
           </w:tcPr>
           <w:p>
             <w:pPr>
-              <w:spacing w:after="0" w:line="240"/>
-            </w:pPr>
-            <w:r>
-              <w:rPr>
-                <w:rFonts w:ascii="Times New Roman" w:cs="Times New Roman" w:eastAsia="Times New Roman" w:hAnsi="Times New Roman"/>
-                <w:b/>
-                <w:bCs/>
-                <w:i w:val="false"/>
+              <w:keepNext w:val="0"/>
+              <w:keepLines w:val="0"/>
+              <w:spacing w:after="20" w:line="240" w:before="0"/>
+            </w:pPr>
+            <w:r>
+              <w:rPr>
+                <w:rFonts w:ascii="Times New Roman" w:cs="Times New Roman" w:eastAsia="Times New Roman" w:hAnsi="Times New Roman"/>
+                <w:b/>
+                <w:bCs/>
+                <w:i w:val="0"/>
                 <w:iCs w:val="false"/>
-                <w:color w:val="000000"/>
-                <w:sz w:val="22"/>
+                <w:color w:val="323539"/>
+                <w:sz w:val="16"/>
                 <w:szCs w:val="22"/>
               </w:rPr>
               <w:t xml:space="preserve">{{ИНН_ПОДРЯДЧИКА}}</w:t>
@@ -443,7 +500,9 @@
                 <w:rFonts w:ascii="Times New Roman" w:cs="Times New Roman" w:eastAsia="Times New Roman" w:hAnsi="Times New Roman"/>
                 <w:b w:val="false"/>
                 <w:bCs w:val="false"/>
-                <w:sz w:val="22"/>
+                <w:i w:val="0"/>
+                <w:color w:val="323539"/>
+                <w:sz w:val="16"/>
                 <w:szCs w:val="22"/>
               </w:rPr>
               <w:t xml:space="preserve">, </w:t>
@@ -453,10 +512,10 @@
                 <w:rFonts w:ascii="Times New Roman" w:cs="Times New Roman" w:eastAsia="Times New Roman" w:hAnsi="Times New Roman"/>
                 <w:b/>
                 <w:bCs/>
-                <w:i w:val="false"/>
+                <w:i w:val="0"/>
                 <w:iCs w:val="false"/>
-                <w:color w:val="000000"/>
-                <w:sz w:val="22"/>
+                <w:color w:val="323539"/>
+                <w:sz w:val="16"/>
                 <w:szCs w:val="22"/>
               </w:rPr>
               <w:t xml:space="preserve">{{ОГРН_ПОДРЯДЧИКА}}</w:t>
@@ -475,14 +534,18 @@
           </w:tcPr>
           <w:p>
             <w:pPr>
-              <w:spacing w:after="0" w:line="240"/>
-            </w:pPr>
-            <w:r>
-              <w:rPr>
-                <w:rFonts w:ascii="Times New Roman" w:cs="Times New Roman" w:eastAsia="Times New Roman" w:hAnsi="Times New Roman"/>
-                <w:b w:val="false"/>
-                <w:bCs w:val="false"/>
-                <w:sz w:val="22"/>
+              <w:keepNext w:val="0"/>
+              <w:keepLines w:val="0"/>
+              <w:spacing w:after="20" w:line="240" w:before="0"/>
+            </w:pPr>
+            <w:r>
+              <w:rPr>
+                <w:rFonts w:ascii="Times New Roman" w:cs="Times New Roman" w:eastAsia="Times New Roman" w:hAnsi="Times New Roman"/>
+                <w:b w:val="false"/>
+                <w:bCs w:val="false"/>
+                <w:i w:val="0"/>
+                <w:color w:val="323539"/>
+                <w:sz w:val="16"/>
                 <w:szCs w:val="22"/>
               </w:rPr>
               <w:t xml:space="preserve">ИНН и ОГРН вашей организации</w:t>
@@ -501,14 +564,18 @@
           </w:tcPr>
           <w:p>
             <w:pPr>
-              <w:spacing w:after="0" w:line="240"/>
-            </w:pPr>
-            <w:r>
-              <w:rPr>
-                <w:rFonts w:ascii="Times New Roman" w:cs="Times New Roman" w:eastAsia="Times New Roman" w:hAnsi="Times New Roman"/>
-                <w:b w:val="false"/>
-                <w:bCs w:val="false"/>
-                <w:sz w:val="22"/>
+              <w:keepNext w:val="0"/>
+              <w:keepLines w:val="0"/>
+              <w:spacing w:after="20" w:line="240" w:before="0"/>
+            </w:pPr>
+            <w:r>
+              <w:rPr>
+                <w:rFonts w:ascii="Times New Roman" w:cs="Times New Roman" w:eastAsia="Times New Roman" w:hAnsi="Times New Roman"/>
+                <w:b w:val="false"/>
+                <w:bCs w:val="false"/>
+                <w:i w:val="0"/>
+                <w:color w:val="323539"/>
+                <w:sz w:val="16"/>
                 <w:szCs w:val="22"/>
               </w:rPr>
               <w:t xml:space="preserve">выписка ЕГРЮЛ</w:t>
@@ -529,17 +596,19 @@
           </w:tcPr>
           <w:p>
             <w:pPr>
-              <w:spacing w:after="0" w:line="240"/>
-            </w:pPr>
-            <w:r>
-              <w:rPr>
-                <w:rFonts w:ascii="Times New Roman" w:cs="Times New Roman" w:eastAsia="Times New Roman" w:hAnsi="Times New Roman"/>
-                <w:b/>
-                <w:bCs/>
-                <w:i w:val="false"/>
+              <w:keepNext w:val="0"/>
+              <w:keepLines w:val="0"/>
+              <w:spacing w:after="20" w:line="240" w:before="0"/>
+            </w:pPr>
+            <w:r>
+              <w:rPr>
+                <w:rFonts w:ascii="Times New Roman" w:cs="Times New Roman" w:eastAsia="Times New Roman" w:hAnsi="Times New Roman"/>
+                <w:b/>
+                <w:bCs/>
+                <w:i w:val="0"/>
                 <w:iCs w:val="false"/>
-                <w:color w:val="000000"/>
-                <w:sz w:val="22"/>
+                <w:color w:val="323539"/>
+                <w:sz w:val="16"/>
                 <w:szCs w:val="22"/>
               </w:rPr>
               <w:t xml:space="preserve">{{АДРЕС_ПОДРЯДЧИКА}}</w:t>
@@ -558,14 +627,18 @@
           </w:tcPr>
           <w:p>
             <w:pPr>
-              <w:spacing w:after="0" w:line="240"/>
-            </w:pPr>
-            <w:r>
-              <w:rPr>
-                <w:rFonts w:ascii="Times New Roman" w:cs="Times New Roman" w:eastAsia="Times New Roman" w:hAnsi="Times New Roman"/>
-                <w:b w:val="false"/>
-                <w:bCs w:val="false"/>
-                <w:sz w:val="22"/>
+              <w:keepNext w:val="0"/>
+              <w:keepLines w:val="0"/>
+              <w:spacing w:after="20" w:line="240" w:before="0"/>
+            </w:pPr>
+            <w:r>
+              <w:rPr>
+                <w:rFonts w:ascii="Times New Roman" w:cs="Times New Roman" w:eastAsia="Times New Roman" w:hAnsi="Times New Roman"/>
+                <w:b w:val="false"/>
+                <w:bCs w:val="false"/>
+                <w:i w:val="0"/>
+                <w:color w:val="323539"/>
+                <w:sz w:val="16"/>
                 <w:szCs w:val="22"/>
               </w:rPr>
               <w:t xml:space="preserve">Юридический адрес вашей организации</w:t>
@@ -584,14 +657,18 @@
           </w:tcPr>
           <w:p>
             <w:pPr>
-              <w:spacing w:after="0" w:line="240"/>
-            </w:pPr>
-            <w:r>
-              <w:rPr>
-                <w:rFonts w:ascii="Times New Roman" w:cs="Times New Roman" w:eastAsia="Times New Roman" w:hAnsi="Times New Roman"/>
-                <w:b w:val="false"/>
-                <w:bCs w:val="false"/>
-                <w:sz w:val="22"/>
+              <w:keepNext w:val="0"/>
+              <w:keepLines w:val="0"/>
+              <w:spacing w:after="20" w:line="240" w:before="0"/>
+            </w:pPr>
+            <w:r>
+              <w:rPr>
+                <w:rFonts w:ascii="Times New Roman" w:cs="Times New Roman" w:eastAsia="Times New Roman" w:hAnsi="Times New Roman"/>
+                <w:b w:val="false"/>
+                <w:bCs w:val="false"/>
+                <w:i w:val="0"/>
+                <w:color w:val="323539"/>
+                <w:sz w:val="16"/>
                 <w:szCs w:val="22"/>
               </w:rPr>
               <w:t xml:space="preserve">выписка ЕГРЮЛ</w:t>
@@ -612,17 +689,19 @@
           </w:tcPr>
           <w:p>
             <w:pPr>
-              <w:spacing w:after="0" w:line="240"/>
-            </w:pPr>
-            <w:r>
-              <w:rPr>
-                <w:rFonts w:ascii="Times New Roman" w:cs="Times New Roman" w:eastAsia="Times New Roman" w:hAnsi="Times New Roman"/>
-                <w:b/>
-                <w:bCs/>
-                <w:i w:val="false"/>
+              <w:keepNext w:val="0"/>
+              <w:keepLines w:val="0"/>
+              <w:spacing w:after="20" w:line="240" w:before="0"/>
+            </w:pPr>
+            <w:r>
+              <w:rPr>
+                <w:rFonts w:ascii="Times New Roman" w:cs="Times New Roman" w:eastAsia="Times New Roman" w:hAnsi="Times New Roman"/>
+                <w:b/>
+                <w:bCs/>
+                <w:i w:val="0"/>
                 <w:iCs w:val="false"/>
-                <w:color w:val="000000"/>
-                <w:sz w:val="22"/>
+                <w:color w:val="323539"/>
+                <w:sz w:val="16"/>
                 <w:szCs w:val="22"/>
               </w:rPr>
               <w:t xml:space="preserve">{{КОНТАКТЫ_ПОДРЯДЧИКА}}</w:t>
@@ -641,14 +720,18 @@
           </w:tcPr>
           <w:p>
             <w:pPr>
-              <w:spacing w:after="0" w:line="240"/>
-            </w:pPr>
-            <w:r>
-              <w:rPr>
-                <w:rFonts w:ascii="Times New Roman" w:cs="Times New Roman" w:eastAsia="Times New Roman" w:hAnsi="Times New Roman"/>
-                <w:b w:val="false"/>
-                <w:bCs w:val="false"/>
-                <w:sz w:val="22"/>
+              <w:keepNext w:val="0"/>
+              <w:keepLines w:val="0"/>
+              <w:spacing w:after="20" w:line="240" w:before="0"/>
+            </w:pPr>
+            <w:r>
+              <w:rPr>
+                <w:rFonts w:ascii="Times New Roman" w:cs="Times New Roman" w:eastAsia="Times New Roman" w:hAnsi="Times New Roman"/>
+                <w:b w:val="false"/>
+                <w:bCs w:val="false"/>
+                <w:i w:val="0"/>
+                <w:color w:val="323539"/>
+                <w:sz w:val="16"/>
                 <w:szCs w:val="22"/>
               </w:rPr>
               <w:t xml:space="preserve">Телефон и адрес электронной почты для суда</w:t>
@@ -667,14 +750,18 @@
           </w:tcPr>
           <w:p>
             <w:pPr>
-              <w:spacing w:after="0" w:line="240"/>
-            </w:pPr>
-            <w:r>
-              <w:rPr>
-                <w:rFonts w:ascii="Times New Roman" w:cs="Times New Roman" w:eastAsia="Times New Roman" w:hAnsi="Times New Roman"/>
-                <w:b w:val="false"/>
-                <w:bCs w:val="false"/>
-                <w:sz w:val="22"/>
+              <w:keepNext w:val="0"/>
+              <w:keepLines w:val="0"/>
+              <w:spacing w:after="20" w:line="240" w:before="0"/>
+            </w:pPr>
+            <w:r>
+              <w:rPr>
+                <w:rFonts w:ascii="Times New Roman" w:cs="Times New Roman" w:eastAsia="Times New Roman" w:hAnsi="Times New Roman"/>
+                <w:b w:val="false"/>
+                <w:bCs w:val="false"/>
+                <w:i w:val="0"/>
+                <w:color w:val="323539"/>
+                <w:sz w:val="16"/>
                 <w:szCs w:val="22"/>
               </w:rPr>
               <w:t xml:space="preserve">ваши рабочие контакты</w:t>
@@ -695,17 +782,19 @@
           </w:tcPr>
           <w:p>
             <w:pPr>
-              <w:spacing w:after="0" w:line="240"/>
-            </w:pPr>
-            <w:r>
-              <w:rPr>
-                <w:rFonts w:ascii="Times New Roman" w:cs="Times New Roman" w:eastAsia="Times New Roman" w:hAnsi="Times New Roman"/>
-                <w:b/>
-                <w:bCs/>
-                <w:i w:val="false"/>
+              <w:keepNext w:val="0"/>
+              <w:keepLines w:val="0"/>
+              <w:spacing w:after="20" w:line="240" w:before="0"/>
+            </w:pPr>
+            <w:r>
+              <w:rPr>
+                <w:rFonts w:ascii="Times New Roman" w:cs="Times New Roman" w:eastAsia="Times New Roman" w:hAnsi="Times New Roman"/>
+                <w:b/>
+                <w:bCs/>
+                <w:i w:val="0"/>
                 <w:iCs w:val="false"/>
-                <w:color w:val="000000"/>
-                <w:sz w:val="22"/>
+                <w:color w:val="323539"/>
+                <w:sz w:val="16"/>
                 <w:szCs w:val="22"/>
               </w:rPr>
               <w:t xml:space="preserve">{{БАНКОВСКИЕ_РЕКВИЗИТЫ_ПОДРЯДЧИКА}}</w:t>
@@ -724,14 +813,18 @@
           </w:tcPr>
           <w:p>
             <w:pPr>
-              <w:spacing w:after="0" w:line="240"/>
-            </w:pPr>
-            <w:r>
-              <w:rPr>
-                <w:rFonts w:ascii="Times New Roman" w:cs="Times New Roman" w:eastAsia="Times New Roman" w:hAnsi="Times New Roman"/>
-                <w:b w:val="false"/>
-                <w:bCs w:val="false"/>
-                <w:sz w:val="22"/>
+              <w:keepNext w:val="0"/>
+              <w:keepLines w:val="0"/>
+              <w:spacing w:after="20" w:line="240" w:before="0"/>
+            </w:pPr>
+            <w:r>
+              <w:rPr>
+                <w:rFonts w:ascii="Times New Roman" w:cs="Times New Roman" w:eastAsia="Times New Roman" w:hAnsi="Times New Roman"/>
+                <w:b w:val="false"/>
+                <w:bCs w:val="false"/>
+                <w:i w:val="0"/>
+                <w:color w:val="323539"/>
+                <w:sz w:val="16"/>
                 <w:szCs w:val="22"/>
               </w:rPr>
               <w:t xml:space="preserve">Расчётный счёт, банк, БИК, корсчёт</w:t>
@@ -750,14 +843,18 @@
           </w:tcPr>
           <w:p>
             <w:pPr>
-              <w:spacing w:after="0" w:line="240"/>
-            </w:pPr>
-            <w:r>
-              <w:rPr>
-                <w:rFonts w:ascii="Times New Roman" w:cs="Times New Roman" w:eastAsia="Times New Roman" w:hAnsi="Times New Roman"/>
-                <w:b w:val="false"/>
-                <w:bCs w:val="false"/>
-                <w:sz w:val="22"/>
+              <w:keepNext w:val="0"/>
+              <w:keepLines w:val="0"/>
+              <w:spacing w:after="20" w:line="240" w:before="0"/>
+            </w:pPr>
+            <w:r>
+              <w:rPr>
+                <w:rFonts w:ascii="Times New Roman" w:cs="Times New Roman" w:eastAsia="Times New Roman" w:hAnsi="Times New Roman"/>
+                <w:b w:val="false"/>
+                <w:bCs w:val="false"/>
+                <w:i w:val="0"/>
+                <w:color w:val="323539"/>
+                <w:sz w:val="16"/>
                 <w:szCs w:val="22"/>
               </w:rPr>
               <w:t xml:space="preserve">справка банка</w:t>
@@ -778,17 +875,19 @@
           </w:tcPr>
           <w:p>
             <w:pPr>
-              <w:spacing w:after="0" w:line="240"/>
-            </w:pPr>
-            <w:r>
-              <w:rPr>
-                <w:rFonts w:ascii="Times New Roman" w:cs="Times New Roman" w:eastAsia="Times New Roman" w:hAnsi="Times New Roman"/>
-                <w:b/>
-                <w:bCs/>
-                <w:i w:val="false"/>
+              <w:keepNext w:val="0"/>
+              <w:keepLines w:val="0"/>
+              <w:spacing w:after="20" w:line="240" w:before="0"/>
+            </w:pPr>
+            <w:r>
+              <w:rPr>
+                <w:rFonts w:ascii="Times New Roman" w:cs="Times New Roman" w:eastAsia="Times New Roman" w:hAnsi="Times New Roman"/>
+                <w:b/>
+                <w:bCs/>
+                <w:i w:val="0"/>
                 <w:iCs w:val="false"/>
-                <w:color w:val="000000"/>
-                <w:sz w:val="22"/>
+                <w:color w:val="323539"/>
+                <w:sz w:val="16"/>
                 <w:szCs w:val="22"/>
               </w:rPr>
               <w:t xml:space="preserve">{{НАИМЕНОВАНИЕ_ЗАКАЗЧИКА}}</w:t>
@@ -807,14 +906,18 @@
           </w:tcPr>
           <w:p>
             <w:pPr>
-              <w:spacing w:after="0" w:line="240"/>
-            </w:pPr>
-            <w:r>
-              <w:rPr>
-                <w:rFonts w:ascii="Times New Roman" w:cs="Times New Roman" w:eastAsia="Times New Roman" w:hAnsi="Times New Roman"/>
-                <w:b w:val="false"/>
-                <w:bCs w:val="false"/>
-                <w:sz w:val="22"/>
+              <w:keepNext w:val="0"/>
+              <w:keepLines w:val="0"/>
+              <w:spacing w:after="20" w:line="240" w:before="0"/>
+            </w:pPr>
+            <w:r>
+              <w:rPr>
+                <w:rFonts w:ascii="Times New Roman" w:cs="Times New Roman" w:eastAsia="Times New Roman" w:hAnsi="Times New Roman"/>
+                <w:b w:val="false"/>
+                <w:bCs w:val="false"/>
+                <w:i w:val="0"/>
+                <w:color w:val="323539"/>
+                <w:sz w:val="16"/>
                 <w:szCs w:val="22"/>
               </w:rPr>
               <w:t xml:space="preserve">Полное наименование должника — стороны договора, обязанной платить</w:t>
@@ -833,14 +936,18 @@
           </w:tcPr>
           <w:p>
             <w:pPr>
-              <w:spacing w:after="0" w:line="240"/>
-            </w:pPr>
-            <w:r>
-              <w:rPr>
-                <w:rFonts w:ascii="Times New Roman" w:cs="Times New Roman" w:eastAsia="Times New Roman" w:hAnsi="Times New Roman"/>
-                <w:b w:val="false"/>
-                <w:bCs w:val="false"/>
-                <w:sz w:val="22"/>
+              <w:keepNext w:val="0"/>
+              <w:keepLines w:val="0"/>
+              <w:spacing w:after="20" w:line="240" w:before="0"/>
+            </w:pPr>
+            <w:r>
+              <w:rPr>
+                <w:rFonts w:ascii="Times New Roman" w:cs="Times New Roman" w:eastAsia="Times New Roman" w:hAnsi="Times New Roman"/>
+                <w:b w:val="false"/>
+                <w:bCs w:val="false"/>
+                <w:i w:val="0"/>
+                <w:color w:val="323539"/>
+                <w:sz w:val="16"/>
                 <w:szCs w:val="22"/>
               </w:rPr>
               <w:t xml:space="preserve">договор и актуальная выписка ЕГРЮЛ</w:t>
@@ -861,17 +968,19 @@
           </w:tcPr>
           <w:p>
             <w:pPr>
-              <w:spacing w:after="0" w:line="240"/>
-            </w:pPr>
-            <w:r>
-              <w:rPr>
-                <w:rFonts w:ascii="Times New Roman" w:cs="Times New Roman" w:eastAsia="Times New Roman" w:hAnsi="Times New Roman"/>
-                <w:b/>
-                <w:bCs/>
-                <w:i w:val="false"/>
+              <w:keepNext w:val="0"/>
+              <w:keepLines w:val="0"/>
+              <w:spacing w:after="20" w:line="240" w:before="0"/>
+            </w:pPr>
+            <w:r>
+              <w:rPr>
+                <w:rFonts w:ascii="Times New Roman" w:cs="Times New Roman" w:eastAsia="Times New Roman" w:hAnsi="Times New Roman"/>
+                <w:b/>
+                <w:bCs/>
+                <w:i w:val="0"/>
                 <w:iCs w:val="false"/>
-                <w:color w:val="000000"/>
-                <w:sz w:val="22"/>
+                <w:color w:val="323539"/>
+                <w:sz w:val="16"/>
                 <w:szCs w:val="22"/>
               </w:rPr>
               <w:t xml:space="preserve">{{ИНН_ЗАКАЗЧИКА}}</w:t>
@@ -881,7 +990,9 @@
                 <w:rFonts w:ascii="Times New Roman" w:cs="Times New Roman" w:eastAsia="Times New Roman" w:hAnsi="Times New Roman"/>
                 <w:b w:val="false"/>
                 <w:bCs w:val="false"/>
-                <w:sz w:val="22"/>
+                <w:i w:val="0"/>
+                <w:color w:val="323539"/>
+                <w:sz w:val="16"/>
                 <w:szCs w:val="22"/>
               </w:rPr>
               <w:t xml:space="preserve">, </w:t>
@@ -891,10 +1002,10 @@
                 <w:rFonts w:ascii="Times New Roman" w:cs="Times New Roman" w:eastAsia="Times New Roman" w:hAnsi="Times New Roman"/>
                 <w:b/>
                 <w:bCs/>
-                <w:i w:val="false"/>
+                <w:i w:val="0"/>
                 <w:iCs w:val="false"/>
-                <w:color w:val="000000"/>
-                <w:sz w:val="22"/>
+                <w:color w:val="323539"/>
+                <w:sz w:val="16"/>
                 <w:szCs w:val="22"/>
               </w:rPr>
               <w:t xml:space="preserve">{{ОГРН_ЗАКАЗЧИКА}}</w:t>
@@ -913,14 +1024,18 @@
           </w:tcPr>
           <w:p>
             <w:pPr>
-              <w:spacing w:after="0" w:line="240"/>
-            </w:pPr>
-            <w:r>
-              <w:rPr>
-                <w:rFonts w:ascii="Times New Roman" w:cs="Times New Roman" w:eastAsia="Times New Roman" w:hAnsi="Times New Roman"/>
-                <w:b w:val="false"/>
-                <w:bCs w:val="false"/>
-                <w:sz w:val="22"/>
+              <w:keepNext w:val="0"/>
+              <w:keepLines w:val="0"/>
+              <w:spacing w:after="20" w:line="240" w:before="0"/>
+            </w:pPr>
+            <w:r>
+              <w:rPr>
+                <w:rFonts w:ascii="Times New Roman" w:cs="Times New Roman" w:eastAsia="Times New Roman" w:hAnsi="Times New Roman"/>
+                <w:b w:val="false"/>
+                <w:bCs w:val="false"/>
+                <w:i w:val="0"/>
+                <w:color w:val="323539"/>
+                <w:sz w:val="16"/>
                 <w:szCs w:val="22"/>
               </w:rPr>
               <w:t xml:space="preserve">ИНН и ОГРН должника</w:t>
@@ -939,14 +1054,18 @@
           </w:tcPr>
           <w:p>
             <w:pPr>
-              <w:spacing w:after="0" w:line="240"/>
-            </w:pPr>
-            <w:r>
-              <w:rPr>
-                <w:rFonts w:ascii="Times New Roman" w:cs="Times New Roman" w:eastAsia="Times New Roman" w:hAnsi="Times New Roman"/>
-                <w:b w:val="false"/>
-                <w:bCs w:val="false"/>
-                <w:sz w:val="22"/>
+              <w:keepNext w:val="0"/>
+              <w:keepLines w:val="0"/>
+              <w:spacing w:after="20" w:line="240" w:before="0"/>
+            </w:pPr>
+            <w:r>
+              <w:rPr>
+                <w:rFonts w:ascii="Times New Roman" w:cs="Times New Roman" w:eastAsia="Times New Roman" w:hAnsi="Times New Roman"/>
+                <w:b w:val="false"/>
+                <w:bCs w:val="false"/>
+                <w:i w:val="0"/>
+                <w:color w:val="323539"/>
+                <w:sz w:val="16"/>
                 <w:szCs w:val="22"/>
               </w:rPr>
               <w:t xml:space="preserve">выписка ЕГРЮЛ; для иска они обязательны (ст. 125 АПК РФ)</w:t>
@@ -967,17 +1086,19 @@
           </w:tcPr>
           <w:p>
             <w:pPr>
-              <w:spacing w:after="0" w:line="240"/>
-            </w:pPr>
-            <w:r>
-              <w:rPr>
-                <w:rFonts w:ascii="Times New Roman" w:cs="Times New Roman" w:eastAsia="Times New Roman" w:hAnsi="Times New Roman"/>
-                <w:b/>
-                <w:bCs/>
-                <w:i w:val="false"/>
+              <w:keepNext w:val="0"/>
+              <w:keepLines w:val="0"/>
+              <w:spacing w:after="20" w:line="240" w:before="0"/>
+            </w:pPr>
+            <w:r>
+              <w:rPr>
+                <w:rFonts w:ascii="Times New Roman" w:cs="Times New Roman" w:eastAsia="Times New Roman" w:hAnsi="Times New Roman"/>
+                <w:b/>
+                <w:bCs/>
+                <w:i w:val="0"/>
                 <w:iCs w:val="false"/>
-                <w:color w:val="000000"/>
-                <w:sz w:val="22"/>
+                <w:color w:val="323539"/>
+                <w:sz w:val="16"/>
                 <w:szCs w:val="22"/>
               </w:rPr>
               <w:t xml:space="preserve">{{АДРЕС_ЗАКАЗЧИКА}}</w:t>
@@ -996,14 +1117,18 @@
           </w:tcPr>
           <w:p>
             <w:pPr>
-              <w:spacing w:after="0" w:line="240"/>
-            </w:pPr>
-            <w:r>
-              <w:rPr>
-                <w:rFonts w:ascii="Times New Roman" w:cs="Times New Roman" w:eastAsia="Times New Roman" w:hAnsi="Times New Roman"/>
-                <w:b w:val="false"/>
-                <w:bCs w:val="false"/>
-                <w:sz w:val="22"/>
+              <w:keepNext w:val="0"/>
+              <w:keepLines w:val="0"/>
+              <w:spacing w:after="20" w:line="240" w:before="0"/>
+            </w:pPr>
+            <w:r>
+              <w:rPr>
+                <w:rFonts w:ascii="Times New Roman" w:cs="Times New Roman" w:eastAsia="Times New Roman" w:hAnsi="Times New Roman"/>
+                <w:b w:val="false"/>
+                <w:bCs w:val="false"/>
+                <w:i w:val="0"/>
+                <w:color w:val="323539"/>
+                <w:sz w:val="16"/>
                 <w:szCs w:val="22"/>
               </w:rPr>
               <w:t xml:space="preserve">Юридический адрес должника</w:t>
@@ -1022,14 +1147,18 @@
           </w:tcPr>
           <w:p>
             <w:pPr>
-              <w:spacing w:after="0" w:line="240"/>
-            </w:pPr>
-            <w:r>
-              <w:rPr>
-                <w:rFonts w:ascii="Times New Roman" w:cs="Times New Roman" w:eastAsia="Times New Roman" w:hAnsi="Times New Roman"/>
-                <w:b w:val="false"/>
-                <w:bCs w:val="false"/>
-                <w:sz w:val="22"/>
+              <w:keepNext w:val="0"/>
+              <w:keepLines w:val="0"/>
+              <w:spacing w:after="20" w:line="240" w:before="0"/>
+            </w:pPr>
+            <w:r>
+              <w:rPr>
+                <w:rFonts w:ascii="Times New Roman" w:cs="Times New Roman" w:eastAsia="Times New Roman" w:hAnsi="Times New Roman"/>
+                <w:b w:val="false"/>
+                <w:bCs w:val="false"/>
+                <w:i w:val="0"/>
+                <w:color w:val="323539"/>
+                <w:sz w:val="16"/>
                 <w:szCs w:val="22"/>
               </w:rPr>
               <w:t xml:space="preserve">свежая выписка ЕГРЮЛ, а не шапка договора: адрес мог смениться</w:t>
@@ -1050,17 +1179,19 @@
           </w:tcPr>
           <w:p>
             <w:pPr>
-              <w:spacing w:after="0" w:line="240"/>
-            </w:pPr>
-            <w:r>
-              <w:rPr>
-                <w:rFonts w:ascii="Times New Roman" w:cs="Times New Roman" w:eastAsia="Times New Roman" w:hAnsi="Times New Roman"/>
-                <w:b/>
-                <w:bCs/>
-                <w:i w:val="false"/>
+              <w:keepNext w:val="0"/>
+              <w:keepLines w:val="0"/>
+              <w:spacing w:after="20" w:line="240" w:before="0"/>
+            </w:pPr>
+            <w:r>
+              <w:rPr>
+                <w:rFonts w:ascii="Times New Roman" w:cs="Times New Roman" w:eastAsia="Times New Roman" w:hAnsi="Times New Roman"/>
+                <w:b/>
+                <w:bCs/>
+                <w:i w:val="0"/>
                 <w:iCs w:val="false"/>
-                <w:color w:val="000000"/>
-                <w:sz w:val="22"/>
+                <w:color w:val="323539"/>
+                <w:sz w:val="16"/>
                 <w:szCs w:val="22"/>
               </w:rPr>
               <w:t xml:space="preserve">{{ДОЛЖНОСТЬ_ПОДПИСАНТА}}</w:t>
@@ -1070,7 +1201,9 @@
                 <w:rFonts w:ascii="Times New Roman" w:cs="Times New Roman" w:eastAsia="Times New Roman" w:hAnsi="Times New Roman"/>
                 <w:b w:val="false"/>
                 <w:bCs w:val="false"/>
-                <w:sz w:val="22"/>
+                <w:i w:val="0"/>
+                <w:color w:val="323539"/>
+                <w:sz w:val="16"/>
                 <w:szCs w:val="22"/>
               </w:rPr>
               <w:t xml:space="preserve">, </w:t>
@@ -1080,10 +1213,10 @@
                 <w:rFonts w:ascii="Times New Roman" w:cs="Times New Roman" w:eastAsia="Times New Roman" w:hAnsi="Times New Roman"/>
                 <w:b/>
                 <w:bCs/>
-                <w:i w:val="false"/>
+                <w:i w:val="0"/>
                 <w:iCs w:val="false"/>
-                <w:color w:val="000000"/>
-                <w:sz w:val="22"/>
+                <w:color w:val="323539"/>
+                <w:sz w:val="16"/>
                 <w:szCs w:val="22"/>
               </w:rPr>
               <w:t xml:space="preserve">{{ФИО_ПОДПИСАНТА}}</w:t>
@@ -1102,14 +1235,18 @@
           </w:tcPr>
           <w:p>
             <w:pPr>
-              <w:spacing w:after="0" w:line="240"/>
-            </w:pPr>
-            <w:r>
-              <w:rPr>
-                <w:rFonts w:ascii="Times New Roman" w:cs="Times New Roman" w:eastAsia="Times New Roman" w:hAnsi="Times New Roman"/>
-                <w:b w:val="false"/>
-                <w:bCs w:val="false"/>
-                <w:sz w:val="22"/>
+              <w:keepNext w:val="0"/>
+              <w:keepLines w:val="0"/>
+              <w:spacing w:after="20" w:line="240" w:before="0"/>
+            </w:pPr>
+            <w:r>
+              <w:rPr>
+                <w:rFonts w:ascii="Times New Roman" w:cs="Times New Roman" w:eastAsia="Times New Roman" w:hAnsi="Times New Roman"/>
+                <w:b w:val="false"/>
+                <w:bCs w:val="false"/>
+                <w:i w:val="0"/>
+                <w:color w:val="323539"/>
+                <w:sz w:val="16"/>
                 <w:szCs w:val="22"/>
               </w:rPr>
               <w:t xml:space="preserve">Кто подписывает от вашей организации</w:t>
@@ -1128,14 +1265,18 @@
           </w:tcPr>
           <w:p>
             <w:pPr>
-              <w:spacing w:after="0" w:line="240"/>
-            </w:pPr>
-            <w:r>
-              <w:rPr>
-                <w:rFonts w:ascii="Times New Roman" w:cs="Times New Roman" w:eastAsia="Times New Roman" w:hAnsi="Times New Roman"/>
-                <w:b w:val="false"/>
-                <w:bCs w:val="false"/>
-                <w:sz w:val="22"/>
+              <w:keepNext w:val="0"/>
+              <w:keepLines w:val="0"/>
+              <w:spacing w:after="20" w:line="240" w:before="0"/>
+            </w:pPr>
+            <w:r>
+              <w:rPr>
+                <w:rFonts w:ascii="Times New Roman" w:cs="Times New Roman" w:eastAsia="Times New Roman" w:hAnsi="Times New Roman"/>
+                <w:b w:val="false"/>
+                <w:bCs w:val="false"/>
+                <w:i w:val="0"/>
+                <w:color w:val="323539"/>
+                <w:sz w:val="16"/>
                 <w:szCs w:val="22"/>
               </w:rPr>
               <w:t xml:space="preserve">устав, доверенность</w:t>
@@ -1156,17 +1297,19 @@
           </w:tcPr>
           <w:p>
             <w:pPr>
-              <w:spacing w:after="0" w:line="240"/>
-            </w:pPr>
-            <w:r>
-              <w:rPr>
-                <w:rFonts w:ascii="Times New Roman" w:cs="Times New Roman" w:eastAsia="Times New Roman" w:hAnsi="Times New Roman"/>
-                <w:b/>
-                <w:bCs/>
-                <w:i w:val="false"/>
+              <w:keepNext w:val="0"/>
+              <w:keepLines w:val="0"/>
+              <w:spacing w:after="20" w:line="240" w:before="0"/>
+            </w:pPr>
+            <w:r>
+              <w:rPr>
+                <w:rFonts w:ascii="Times New Roman" w:cs="Times New Roman" w:eastAsia="Times New Roman" w:hAnsi="Times New Roman"/>
+                <w:b/>
+                <w:bCs/>
+                <w:i w:val="0"/>
                 <w:iCs w:val="false"/>
-                <w:color w:val="000000"/>
-                <w:sz w:val="22"/>
+                <w:color w:val="323539"/>
+                <w:sz w:val="16"/>
                 <w:szCs w:val="22"/>
               </w:rPr>
               <w:t xml:space="preserve">{{ОСНОВАНИЕ_ПОЛНОМОЧИЙ}}</w:t>
@@ -1185,14 +1328,18 @@
           </w:tcPr>
           <w:p>
             <w:pPr>
-              <w:spacing w:after="0" w:line="240"/>
-            </w:pPr>
-            <w:r>
-              <w:rPr>
-                <w:rFonts w:ascii="Times New Roman" w:cs="Times New Roman" w:eastAsia="Times New Roman" w:hAnsi="Times New Roman"/>
-                <w:b w:val="false"/>
-                <w:bCs w:val="false"/>
-                <w:sz w:val="22"/>
+              <w:keepNext w:val="0"/>
+              <w:keepLines w:val="0"/>
+              <w:spacing w:after="20" w:line="240" w:before="0"/>
+            </w:pPr>
+            <w:r>
+              <w:rPr>
+                <w:rFonts w:ascii="Times New Roman" w:cs="Times New Roman" w:eastAsia="Times New Roman" w:hAnsi="Times New Roman"/>
+                <w:b w:val="false"/>
+                <w:bCs w:val="false"/>
+                <w:i w:val="0"/>
+                <w:color w:val="323539"/>
+                <w:sz w:val="16"/>
                 <w:szCs w:val="22"/>
               </w:rPr>
               <w:t xml:space="preserve">«действующего на основании Устава» либо реквизиты доверенности</w:t>
@@ -1211,14 +1358,18 @@
           </w:tcPr>
           <w:p>
             <w:pPr>
-              <w:spacing w:after="0" w:line="240"/>
-            </w:pPr>
-            <w:r>
-              <w:rPr>
-                <w:rFonts w:ascii="Times New Roman" w:cs="Times New Roman" w:eastAsia="Times New Roman" w:hAnsi="Times New Roman"/>
-                <w:b w:val="false"/>
-                <w:bCs w:val="false"/>
-                <w:sz w:val="22"/>
+              <w:keepNext w:val="0"/>
+              <w:keepLines w:val="0"/>
+              <w:spacing w:after="20" w:line="240" w:before="0"/>
+            </w:pPr>
+            <w:r>
+              <w:rPr>
+                <w:rFonts w:ascii="Times New Roman" w:cs="Times New Roman" w:eastAsia="Times New Roman" w:hAnsi="Times New Roman"/>
+                <w:b w:val="false"/>
+                <w:bCs w:val="false"/>
+                <w:i w:val="0"/>
+                <w:color w:val="323539"/>
+                <w:sz w:val="16"/>
                 <w:szCs w:val="22"/>
               </w:rPr>
               <w:t xml:space="preserve">устав, доверенность</w:t>
@@ -1229,20 +1380,22 @@
     </w:tbl>
     <w:p>
       <w:pPr>
-        <w:spacing w:after="120" w:line="276"/>
+        <w:spacing w:after="60" w:line="276" w:before="0"/>
       </w:pPr>
     </w:p>
     <w:p>
       <w:pPr>
         <w:pStyle w:val="Heading2"/>
         <w:keepNext/>
-        <w:spacing w:after="120" w:before="260"/>
+        <w:spacing w:after="60" w:before="0"/>
       </w:pPr>
       <w:r>
         <w:rPr>
           <w:rFonts w:ascii="Times New Roman" w:cs="Times New Roman" w:eastAsia="Times New Roman" w:hAnsi="Times New Roman"/>
           <w:b/>
           <w:bCs/>
+          <w:i w:val="0"/>
+          <w:color w:val="323539"/>
           <w:sz w:val="26"/>
           <w:szCs w:val="26"/>
         </w:rPr>
@@ -1260,11 +1413,12 @@
           <w:insideH w:val="single" w:color="auto" w:sz="4"/>
           <w:insideV w:val="single" w:color="auto" w:sz="4"/>
         </w:tblBorders>
+        <w:tblLayout w:type="fixed"/>
       </w:tblPr>
       <w:tblGrid>
-        <w:gridCol w:w="3200"/>
-        <w:gridCol w:w="3300"/>
-        <w:gridCol w:w="2860"/>
+        <w:gridCol w:w="3798"/>
+        <w:gridCol w:w="3458"/>
+        <w:gridCol w:w="2551"/>
       </w:tblGrid>
       <w:tr>
         <w:trPr>
@@ -1283,14 +1437,18 @@
           </w:tcPr>
           <w:p>
             <w:pPr>
-              <w:spacing w:after="0" w:line="240"/>
-            </w:pPr>
-            <w:r>
-              <w:rPr>
-                <w:rFonts w:ascii="Times New Roman" w:cs="Times New Roman" w:eastAsia="Times New Roman" w:hAnsi="Times New Roman"/>
-                <w:b/>
-                <w:bCs/>
-                <w:sz w:val="22"/>
+              <w:keepNext w:val="0"/>
+              <w:keepLines w:val="0"/>
+              <w:spacing w:after="20" w:line="240" w:before="0"/>
+            </w:pPr>
+            <w:r>
+              <w:rPr>
+                <w:rFonts w:ascii="Times New Roman" w:cs="Times New Roman" w:eastAsia="Times New Roman" w:hAnsi="Times New Roman"/>
+                <w:b/>
+                <w:bCs/>
+                <w:i w:val="0"/>
+                <w:color w:val="323539"/>
+                <w:sz w:val="16"/>
                 <w:szCs w:val="22"/>
               </w:rPr>
               <w:t xml:space="preserve">Поле</w:t>
@@ -1310,14 +1468,18 @@
           </w:tcPr>
           <w:p>
             <w:pPr>
-              <w:spacing w:after="0" w:line="240"/>
-            </w:pPr>
-            <w:r>
-              <w:rPr>
-                <w:rFonts w:ascii="Times New Roman" w:cs="Times New Roman" w:eastAsia="Times New Roman" w:hAnsi="Times New Roman"/>
-                <w:b/>
-                <w:bCs/>
-                <w:sz w:val="22"/>
+              <w:keepNext w:val="0"/>
+              <w:keepLines w:val="0"/>
+              <w:spacing w:after="20" w:line="240" w:before="0"/>
+            </w:pPr>
+            <w:r>
+              <w:rPr>
+                <w:rFonts w:ascii="Times New Roman" w:cs="Times New Roman" w:eastAsia="Times New Roman" w:hAnsi="Times New Roman"/>
+                <w:b/>
+                <w:bCs/>
+                <w:i w:val="0"/>
+                <w:color w:val="323539"/>
+                <w:sz w:val="16"/>
                 <w:szCs w:val="22"/>
               </w:rPr>
               <w:t xml:space="preserve">Что вписать</w:t>
@@ -1337,14 +1499,18 @@
           </w:tcPr>
           <w:p>
             <w:pPr>
-              <w:spacing w:after="0" w:line="240"/>
-            </w:pPr>
-            <w:r>
-              <w:rPr>
-                <w:rFonts w:ascii="Times New Roman" w:cs="Times New Roman" w:eastAsia="Times New Roman" w:hAnsi="Times New Roman"/>
-                <w:b/>
-                <w:bCs/>
-                <w:sz w:val="22"/>
+              <w:keepNext w:val="0"/>
+              <w:keepLines w:val="0"/>
+              <w:spacing w:after="20" w:line="240" w:before="0"/>
+            </w:pPr>
+            <w:r>
+              <w:rPr>
+                <w:rFonts w:ascii="Times New Roman" w:cs="Times New Roman" w:eastAsia="Times New Roman" w:hAnsi="Times New Roman"/>
+                <w:b/>
+                <w:bCs/>
+                <w:i w:val="0"/>
+                <w:color w:val="323539"/>
+                <w:sz w:val="16"/>
                 <w:szCs w:val="22"/>
               </w:rPr>
               <w:t xml:space="preserve">Откуда взять</w:t>
@@ -1365,17 +1531,19 @@
           </w:tcPr>
           <w:p>
             <w:pPr>
-              <w:spacing w:after="0" w:line="240"/>
-            </w:pPr>
-            <w:r>
-              <w:rPr>
-                <w:rFonts w:ascii="Times New Roman" w:cs="Times New Roman" w:eastAsia="Times New Roman" w:hAnsi="Times New Roman"/>
-                <w:b/>
-                <w:bCs/>
-                <w:i w:val="false"/>
+              <w:keepNext w:val="0"/>
+              <w:keepLines w:val="0"/>
+              <w:spacing w:after="20" w:line="240" w:before="0"/>
+            </w:pPr>
+            <w:r>
+              <w:rPr>
+                <w:rFonts w:ascii="Times New Roman" w:cs="Times New Roman" w:eastAsia="Times New Roman" w:hAnsi="Times New Roman"/>
+                <w:b/>
+                <w:bCs/>
+                <w:i w:val="0"/>
                 <w:iCs w:val="false"/>
-                <w:color w:val="000000"/>
-                <w:sz w:val="22"/>
+                <w:color w:val="323539"/>
+                <w:sz w:val="16"/>
                 <w:szCs w:val="22"/>
               </w:rPr>
               <w:t xml:space="preserve">{{НАИМЕНОВАНИЕ_АДРЕСАТА}}</w:t>
@@ -1385,7 +1553,9 @@
                 <w:rFonts w:ascii="Times New Roman" w:cs="Times New Roman" w:eastAsia="Times New Roman" w:hAnsi="Times New Roman"/>
                 <w:b w:val="false"/>
                 <w:bCs w:val="false"/>
-                <w:sz w:val="22"/>
+                <w:i w:val="0"/>
+                <w:color w:val="323539"/>
+                <w:sz w:val="16"/>
                 <w:szCs w:val="22"/>
               </w:rPr>
               <w:t xml:space="preserve">, </w:t>
@@ -1395,10 +1565,10 @@
                 <w:rFonts w:ascii="Times New Roman" w:cs="Times New Roman" w:eastAsia="Times New Roman" w:hAnsi="Times New Roman"/>
                 <w:b/>
                 <w:bCs/>
-                <w:i w:val="false"/>
+                <w:i w:val="0"/>
                 <w:iCs w:val="false"/>
-                <w:color w:val="000000"/>
-                <w:sz w:val="22"/>
+                <w:color w:val="323539"/>
+                <w:sz w:val="16"/>
                 <w:szCs w:val="22"/>
               </w:rPr>
               <w:t xml:space="preserve">{{АДРЕС_АДРЕСАТА}}</w:t>
@@ -1417,14 +1587,18 @@
           </w:tcPr>
           <w:p>
             <w:pPr>
-              <w:spacing w:after="0" w:line="240"/>
-            </w:pPr>
-            <w:r>
-              <w:rPr>
-                <w:rFonts w:ascii="Times New Roman" w:cs="Times New Roman" w:eastAsia="Times New Roman" w:hAnsi="Times New Roman"/>
-                <w:b w:val="false"/>
-                <w:bCs w:val="false"/>
-                <w:sz w:val="22"/>
+              <w:keepNext w:val="0"/>
+              <w:keepLines w:val="0"/>
+              <w:spacing w:after="20" w:line="240" w:before="0"/>
+            </w:pPr>
+            <w:r>
+              <w:rPr>
+                <w:rFonts w:ascii="Times New Roman" w:cs="Times New Roman" w:eastAsia="Times New Roman" w:hAnsi="Times New Roman"/>
+                <w:b w:val="false"/>
+                <w:bCs w:val="false"/>
+                <w:i w:val="0"/>
+                <w:color w:val="323539"/>
+                <w:sz w:val="16"/>
                 <w:szCs w:val="22"/>
               </w:rPr>
               <w:t xml:space="preserve">Кому направляется запрос о статусе объекта: ваша сторона по договору либо застройщик</w:t>
@@ -1443,14 +1617,18 @@
           </w:tcPr>
           <w:p>
             <w:pPr>
-              <w:spacing w:after="0" w:line="240"/>
-            </w:pPr>
-            <w:r>
-              <w:rPr>
-                <w:rFonts w:ascii="Times New Roman" w:cs="Times New Roman" w:eastAsia="Times New Roman" w:hAnsi="Times New Roman"/>
-                <w:b w:val="false"/>
-                <w:bCs w:val="false"/>
-                <w:sz w:val="22"/>
+              <w:keepNext w:val="0"/>
+              <w:keepLines w:val="0"/>
+              <w:spacing w:after="20" w:line="240" w:before="0"/>
+            </w:pPr>
+            <w:r>
+              <w:rPr>
+                <w:rFonts w:ascii="Times New Roman" w:cs="Times New Roman" w:eastAsia="Times New Roman" w:hAnsi="Times New Roman"/>
+                <w:b w:val="false"/>
+                <w:bCs w:val="false"/>
+                <w:i w:val="0"/>
+                <w:color w:val="323539"/>
+                <w:sz w:val="16"/>
                 <w:szCs w:val="22"/>
               </w:rPr>
               <w:t xml:space="preserve">договор, свежая выписка ЕГРЮЛ</w:t>
@@ -1471,17 +1649,19 @@
           </w:tcPr>
           <w:p>
             <w:pPr>
-              <w:spacing w:after="0" w:line="240"/>
-            </w:pPr>
-            <w:r>
-              <w:rPr>
-                <w:rFonts w:ascii="Times New Roman" w:cs="Times New Roman" w:eastAsia="Times New Roman" w:hAnsi="Times New Roman"/>
-                <w:b/>
-                <w:bCs/>
-                <w:i w:val="false"/>
+              <w:keepNext w:val="0"/>
+              <w:keepLines w:val="0"/>
+              <w:spacing w:after="20" w:line="240" w:before="0"/>
+            </w:pPr>
+            <w:r>
+              <w:rPr>
+                <w:rFonts w:ascii="Times New Roman" w:cs="Times New Roman" w:eastAsia="Times New Roman" w:hAnsi="Times New Roman"/>
+                <w:b/>
+                <w:bCs/>
+                <w:i w:val="0"/>
                 <w:iCs w:val="false"/>
-                <w:color w:val="000000"/>
-                <w:sz w:val="22"/>
+                <w:color w:val="323539"/>
+                <w:sz w:val="16"/>
                 <w:szCs w:val="22"/>
               </w:rPr>
               <w:t xml:space="preserve">{{НАИМЕНОВАНИЕ_ЦЕДЕНТА_ИЛИ_ЗАСТРОЙЩИКА}}</w:t>
@@ -1500,14 +1680,18 @@
           </w:tcPr>
           <w:p>
             <w:pPr>
-              <w:spacing w:after="0" w:line="240"/>
-            </w:pPr>
-            <w:r>
-              <w:rPr>
-                <w:rFonts w:ascii="Times New Roman" w:cs="Times New Roman" w:eastAsia="Times New Roman" w:hAnsi="Times New Roman"/>
-                <w:b w:val="false"/>
-                <w:bCs w:val="false"/>
-                <w:sz w:val="22"/>
+              <w:keepNext w:val="0"/>
+              <w:keepLines w:val="0"/>
+              <w:spacing w:after="20" w:line="240" w:before="0"/>
+            </w:pPr>
+            <w:r>
+              <w:rPr>
+                <w:rFonts w:ascii="Times New Roman" w:cs="Times New Roman" w:eastAsia="Times New Roman" w:hAnsi="Times New Roman"/>
+                <w:b w:val="false"/>
+                <w:bCs w:val="false"/>
+                <w:i w:val="0"/>
+                <w:color w:val="323539"/>
+                <w:sz w:val="16"/>
                 <w:szCs w:val="22"/>
               </w:rPr>
               <w:t xml:space="preserve">Адресат запроса о состоянии счёта эскроу: текущий участник долевого строительства (цедент) либо застройщик</w:t>
@@ -1526,14 +1710,18 @@
           </w:tcPr>
           <w:p>
             <w:pPr>
-              <w:spacing w:after="0" w:line="240"/>
-            </w:pPr>
-            <w:r>
-              <w:rPr>
-                <w:rFonts w:ascii="Times New Roman" w:cs="Times New Roman" w:eastAsia="Times New Roman" w:hAnsi="Times New Roman"/>
-                <w:b w:val="false"/>
-                <w:bCs w:val="false"/>
-                <w:sz w:val="22"/>
+              <w:keepNext w:val="0"/>
+              <w:keepLines w:val="0"/>
+              <w:spacing w:after="20" w:line="240" w:before="0"/>
+            </w:pPr>
+            <w:r>
+              <w:rPr>
+                <w:rFonts w:ascii="Times New Roman" w:cs="Times New Roman" w:eastAsia="Times New Roman" w:hAnsi="Times New Roman"/>
+                <w:b w:val="false"/>
+                <w:bCs w:val="false"/>
+                <w:i w:val="0"/>
+                <w:color w:val="323539"/>
+                <w:sz w:val="16"/>
                 <w:szCs w:val="22"/>
               </w:rPr>
               <w:t xml:space="preserve">проект договора уступки, ДДУ, выписка ЕГРЮЛ</w:t>
@@ -1554,17 +1742,19 @@
           </w:tcPr>
           <w:p>
             <w:pPr>
-              <w:spacing w:after="0" w:line="240"/>
-            </w:pPr>
-            <w:r>
-              <w:rPr>
-                <w:rFonts w:ascii="Times New Roman" w:cs="Times New Roman" w:eastAsia="Times New Roman" w:hAnsi="Times New Roman"/>
-                <w:b/>
-                <w:bCs/>
-                <w:i w:val="false"/>
+              <w:keepNext w:val="0"/>
+              <w:keepLines w:val="0"/>
+              <w:spacing w:after="20" w:line="240" w:before="0"/>
+            </w:pPr>
+            <w:r>
+              <w:rPr>
+                <w:rFonts w:ascii="Times New Roman" w:cs="Times New Roman" w:eastAsia="Times New Roman" w:hAnsi="Times New Roman"/>
+                <w:b/>
+                <w:bCs/>
+                <w:i w:val="0"/>
                 <w:iCs w:val="false"/>
-                <w:color w:val="000000"/>
-                <w:sz w:val="22"/>
+                <w:color w:val="323539"/>
+                <w:sz w:val="16"/>
                 <w:szCs w:val="22"/>
               </w:rPr>
               <w:t xml:space="preserve">{{ИСХОДЯЩИЙ_НОМЕР}}</w:t>
@@ -1574,7 +1764,9 @@
                 <w:rFonts w:ascii="Times New Roman" w:cs="Times New Roman" w:eastAsia="Times New Roman" w:hAnsi="Times New Roman"/>
                 <w:b w:val="false"/>
                 <w:bCs w:val="false"/>
-                <w:sz w:val="22"/>
+                <w:i w:val="0"/>
+                <w:color w:val="323539"/>
+                <w:sz w:val="16"/>
                 <w:szCs w:val="22"/>
               </w:rPr>
               <w:t xml:space="preserve">, </w:t>
@@ -1584,10 +1776,10 @@
                 <w:rFonts w:ascii="Times New Roman" w:cs="Times New Roman" w:eastAsia="Times New Roman" w:hAnsi="Times New Roman"/>
                 <w:b/>
                 <w:bCs/>
-                <w:i w:val="false"/>
+                <w:i w:val="0"/>
                 <w:iCs w:val="false"/>
-                <w:color w:val="000000"/>
-                <w:sz w:val="22"/>
+                <w:color w:val="323539"/>
+                <w:sz w:val="16"/>
                 <w:szCs w:val="22"/>
               </w:rPr>
               <w:t xml:space="preserve">{{ДАТА_ДОКУМЕНТА}}</w:t>
@@ -1606,14 +1798,18 @@
           </w:tcPr>
           <w:p>
             <w:pPr>
-              <w:spacing w:after="0" w:line="240"/>
-            </w:pPr>
-            <w:r>
-              <w:rPr>
-                <w:rFonts w:ascii="Times New Roman" w:cs="Times New Roman" w:eastAsia="Times New Roman" w:hAnsi="Times New Roman"/>
-                <w:b w:val="false"/>
-                <w:bCs w:val="false"/>
-                <w:sz w:val="22"/>
+              <w:keepNext w:val="0"/>
+              <w:keepLines w:val="0"/>
+              <w:spacing w:after="20" w:line="240" w:before="0"/>
+            </w:pPr>
+            <w:r>
+              <w:rPr>
+                <w:rFonts w:ascii="Times New Roman" w:cs="Times New Roman" w:eastAsia="Times New Roman" w:hAnsi="Times New Roman"/>
+                <w:b w:val="false"/>
+                <w:bCs w:val="false"/>
+                <w:i w:val="0"/>
+                <w:color w:val="323539"/>
+                <w:sz w:val="16"/>
                 <w:szCs w:val="22"/>
               </w:rPr>
               <w:t xml:space="preserve">Реквизиты вашего письма</w:t>
@@ -1632,14 +1828,18 @@
           </w:tcPr>
           <w:p>
             <w:pPr>
-              <w:spacing w:after="0" w:line="240"/>
-            </w:pPr>
-            <w:r>
-              <w:rPr>
-                <w:rFonts w:ascii="Times New Roman" w:cs="Times New Roman" w:eastAsia="Times New Roman" w:hAnsi="Times New Roman"/>
-                <w:b w:val="false"/>
-                <w:bCs w:val="false"/>
-                <w:sz w:val="22"/>
+              <w:keepNext w:val="0"/>
+              <w:keepLines w:val="0"/>
+              <w:spacing w:after="20" w:line="240" w:before="0"/>
+            </w:pPr>
+            <w:r>
+              <w:rPr>
+                <w:rFonts w:ascii="Times New Roman" w:cs="Times New Roman" w:eastAsia="Times New Roman" w:hAnsi="Times New Roman"/>
+                <w:b w:val="false"/>
+                <w:bCs w:val="false"/>
+                <w:i w:val="0"/>
+                <w:color w:val="323539"/>
+                <w:sz w:val="16"/>
                 <w:szCs w:val="22"/>
               </w:rPr>
               <w:t xml:space="preserve">ваш журнал исходящих</w:t>
@@ -1660,17 +1860,19 @@
           </w:tcPr>
           <w:p>
             <w:pPr>
-              <w:spacing w:after="0" w:line="240"/>
-            </w:pPr>
-            <w:r>
-              <w:rPr>
-                <w:rFonts w:ascii="Times New Roman" w:cs="Times New Roman" w:eastAsia="Times New Roman" w:hAnsi="Times New Roman"/>
-                <w:b/>
-                <w:bCs/>
-                <w:i w:val="false"/>
+              <w:keepNext w:val="0"/>
+              <w:keepLines w:val="0"/>
+              <w:spacing w:after="20" w:line="240" w:before="0"/>
+            </w:pPr>
+            <w:r>
+              <w:rPr>
+                <w:rFonts w:ascii="Times New Roman" w:cs="Times New Roman" w:eastAsia="Times New Roman" w:hAnsi="Times New Roman"/>
+                <w:b/>
+                <w:bCs/>
+                <w:i w:val="0"/>
                 <w:iCs w:val="false"/>
-                <w:color w:val="000000"/>
-                <w:sz w:val="22"/>
+                <w:color w:val="323539"/>
+                <w:sz w:val="16"/>
                 <w:szCs w:val="22"/>
               </w:rPr>
               <w:t xml:space="preserve">{{НАИМЕНОВАНИЕ_ОБЪЕКТА_ПО_ПРОЕКТНОЙ_ДЕКЛАРАЦИИ}}</w:t>
@@ -1689,14 +1891,18 @@
           </w:tcPr>
           <w:p>
             <w:pPr>
-              <w:spacing w:after="0" w:line="240"/>
-            </w:pPr>
-            <w:r>
-              <w:rPr>
-                <w:rFonts w:ascii="Times New Roman" w:cs="Times New Roman" w:eastAsia="Times New Roman" w:hAnsi="Times New Roman"/>
-                <w:b w:val="false"/>
-                <w:bCs w:val="false"/>
-                <w:sz w:val="22"/>
+              <w:keepNext w:val="0"/>
+              <w:keepLines w:val="0"/>
+              <w:spacing w:after="20" w:line="240" w:before="0"/>
+            </w:pPr>
+            <w:r>
+              <w:rPr>
+                <w:rFonts w:ascii="Times New Roman" w:cs="Times New Roman" w:eastAsia="Times New Roman" w:hAnsi="Times New Roman"/>
+                <w:b w:val="false"/>
+                <w:bCs w:val="false"/>
+                <w:i w:val="0"/>
+                <w:color w:val="323539"/>
+                <w:sz w:val="16"/>
                 <w:szCs w:val="22"/>
               </w:rPr>
               <w:t xml:space="preserve">Наименование и адрес объекта долевого строительства дословно</w:t>
@@ -1715,14 +1921,18 @@
           </w:tcPr>
           <w:p>
             <w:pPr>
-              <w:spacing w:after="0" w:line="240"/>
-            </w:pPr>
-            <w:r>
-              <w:rPr>
-                <w:rFonts w:ascii="Times New Roman" w:cs="Times New Roman" w:eastAsia="Times New Roman" w:hAnsi="Times New Roman"/>
-                <w:b w:val="false"/>
-                <w:bCs w:val="false"/>
-                <w:sz w:val="22"/>
+              <w:keepNext w:val="0"/>
+              <w:keepLines w:val="0"/>
+              <w:spacing w:after="20" w:line="240" w:before="0"/>
+            </w:pPr>
+            <w:r>
+              <w:rPr>
+                <w:rFonts w:ascii="Times New Roman" w:cs="Times New Roman" w:eastAsia="Times New Roman" w:hAnsi="Times New Roman"/>
+                <w:b w:val="false"/>
+                <w:bCs w:val="false"/>
+                <w:i w:val="0"/>
+                <w:color w:val="323539"/>
+                <w:sz w:val="16"/>
                 <w:szCs w:val="22"/>
               </w:rPr>
               <w:t xml:space="preserve">проектная декларация в ЕИСЖС (наш.дом.рф)</w:t>
@@ -1743,17 +1953,19 @@
           </w:tcPr>
           <w:p>
             <w:pPr>
-              <w:spacing w:after="0" w:line="240"/>
-            </w:pPr>
-            <w:r>
-              <w:rPr>
-                <w:rFonts w:ascii="Times New Roman" w:cs="Times New Roman" w:eastAsia="Times New Roman" w:hAnsi="Times New Roman"/>
-                <w:b/>
-                <w:bCs/>
-                <w:i w:val="false"/>
+              <w:keepNext w:val="0"/>
+              <w:keepLines w:val="0"/>
+              <w:spacing w:after="20" w:line="240" w:before="0"/>
+            </w:pPr>
+            <w:r>
+              <w:rPr>
+                <w:rFonts w:ascii="Times New Roman" w:cs="Times New Roman" w:eastAsia="Times New Roman" w:hAnsi="Times New Roman"/>
+                <w:b/>
+                <w:bCs/>
+                <w:i w:val="0"/>
                 <w:iCs w:val="false"/>
-                <w:color w:val="000000"/>
-                <w:sz w:val="22"/>
+                <w:color w:val="323539"/>
+                <w:sz w:val="16"/>
                 <w:szCs w:val="22"/>
               </w:rPr>
               <w:t xml:space="preserve">{{ОСНОВАНИЕ_ЗАПРОСА: …}}</w:t>
@@ -1772,14 +1984,18 @@
           </w:tcPr>
           <w:p>
             <w:pPr>
-              <w:spacing w:after="0" w:line="240"/>
-            </w:pPr>
-            <w:r>
-              <w:rPr>
-                <w:rFonts w:ascii="Times New Roman" w:cs="Times New Roman" w:eastAsia="Times New Roman" w:hAnsi="Times New Roman"/>
-                <w:b w:val="false"/>
-                <w:bCs w:val="false"/>
-                <w:sz w:val="22"/>
+              <w:keepNext w:val="0"/>
+              <w:keepLines w:val="0"/>
+              <w:spacing w:after="20" w:line="240" w:before="0"/>
+            </w:pPr>
+            <w:r>
+              <w:rPr>
+                <w:rFonts w:ascii="Times New Roman" w:cs="Times New Roman" w:eastAsia="Times New Roman" w:hAnsi="Times New Roman"/>
+                <w:b w:val="false"/>
+                <w:bCs w:val="false"/>
+                <w:i w:val="0"/>
+                <w:color w:val="323539"/>
+                <w:sz w:val="16"/>
                 <w:szCs w:val="22"/>
               </w:rPr>
               <w:t xml:space="preserve">Выбрать один вариант из фигурных скобок: предложение о заключении договора либо исполнение действующего договора; невыбранный вариант удалить</w:t>
@@ -1798,14 +2014,18 @@
           </w:tcPr>
           <w:p>
             <w:pPr>
-              <w:spacing w:after="0" w:line="240"/>
-            </w:pPr>
-            <w:r>
-              <w:rPr>
-                <w:rFonts w:ascii="Times New Roman" w:cs="Times New Roman" w:eastAsia="Times New Roman" w:hAnsi="Times New Roman"/>
-                <w:b w:val="false"/>
-                <w:bCs w:val="false"/>
-                <w:sz w:val="22"/>
+              <w:keepNext w:val="0"/>
+              <w:keepLines w:val="0"/>
+              <w:spacing w:after="20" w:line="240" w:before="0"/>
+            </w:pPr>
+            <w:r>
+              <w:rPr>
+                <w:rFonts w:ascii="Times New Roman" w:cs="Times New Roman" w:eastAsia="Times New Roman" w:hAnsi="Times New Roman"/>
+                <w:b w:val="false"/>
+                <w:bCs w:val="false"/>
+                <w:i w:val="0"/>
+                <w:color w:val="323539"/>
+                <w:sz w:val="16"/>
                 <w:szCs w:val="22"/>
               </w:rPr>
               <w:t xml:space="preserve">ваша ситуация; реквизиты договора — из самого договора</w:t>
@@ -1826,17 +2046,19 @@
           </w:tcPr>
           <w:p>
             <w:pPr>
-              <w:spacing w:after="0" w:line="240"/>
-            </w:pPr>
-            <w:r>
-              <w:rPr>
-                <w:rFonts w:ascii="Times New Roman" w:cs="Times New Roman" w:eastAsia="Times New Roman" w:hAnsi="Times New Roman"/>
-                <w:b/>
-                <w:bCs/>
-                <w:i w:val="false"/>
+              <w:keepNext w:val="0"/>
+              <w:keepLines w:val="0"/>
+              <w:spacing w:after="20" w:line="240" w:before="0"/>
+            </w:pPr>
+            <w:r>
+              <w:rPr>
+                <w:rFonts w:ascii="Times New Roman" w:cs="Times New Roman" w:eastAsia="Times New Roman" w:hAnsi="Times New Roman"/>
+                <w:b/>
+                <w:bCs/>
+                <w:i w:val="0"/>
                 <w:iCs w:val="false"/>
-                <w:color w:val="000000"/>
-                <w:sz w:val="22"/>
+                <w:color w:val="323539"/>
+                <w:sz w:val="16"/>
                 <w:szCs w:val="22"/>
               </w:rPr>
               <w:t xml:space="preserve">{{ЧТО_ЗАВИСИТ_ОТ_ВВОДА: …}}</w:t>
@@ -1855,14 +2077,18 @@
           </w:tcPr>
           <w:p>
             <w:pPr>
-              <w:spacing w:after="0" w:line="240"/>
-            </w:pPr>
-            <w:r>
-              <w:rPr>
-                <w:rFonts w:ascii="Times New Roman" w:cs="Times New Roman" w:eastAsia="Times New Roman" w:hAnsi="Times New Roman"/>
-                <w:b w:val="false"/>
-                <w:bCs w:val="false"/>
-                <w:sz w:val="22"/>
+              <w:keepNext w:val="0"/>
+              <w:keepLines w:val="0"/>
+              <w:spacing w:after="20" w:line="240" w:before="0"/>
+            </w:pPr>
+            <w:r>
+              <w:rPr>
+                <w:rFonts w:ascii="Times New Roman" w:cs="Times New Roman" w:eastAsia="Times New Roman" w:hAnsi="Times New Roman"/>
+                <w:b w:val="false"/>
+                <w:bCs w:val="false"/>
+                <w:i w:val="0"/>
+                <w:color w:val="323539"/>
+                <w:sz w:val="16"/>
                 <w:szCs w:val="22"/>
               </w:rPr>
               <w:t xml:space="preserve">Выбрать один вариант: сроки расчётов по договору либо условия предлагаемого договора; невыбранный вариант удалить</w:t>
@@ -1881,14 +2107,18 @@
           </w:tcPr>
           <w:p>
             <w:pPr>
-              <w:spacing w:after="0" w:line="240"/>
-            </w:pPr>
-            <w:r>
-              <w:rPr>
-                <w:rFonts w:ascii="Times New Roman" w:cs="Times New Roman" w:eastAsia="Times New Roman" w:hAnsi="Times New Roman"/>
-                <w:b w:val="false"/>
-                <w:bCs w:val="false"/>
-                <w:sz w:val="22"/>
+              <w:keepNext w:val="0"/>
+              <w:keepLines w:val="0"/>
+              <w:spacing w:after="20" w:line="240" w:before="0"/>
+            </w:pPr>
+            <w:r>
+              <w:rPr>
+                <w:rFonts w:ascii="Times New Roman" w:cs="Times New Roman" w:eastAsia="Times New Roman" w:hAnsi="Times New Roman"/>
+                <w:b w:val="false"/>
+                <w:bCs w:val="false"/>
+                <w:i w:val="0"/>
+                <w:color w:val="323539"/>
+                <w:sz w:val="16"/>
                 <w:szCs w:val="22"/>
               </w:rPr>
               <w:t xml:space="preserve">ваша ситуация</w:t>
@@ -1909,17 +2139,19 @@
           </w:tcPr>
           <w:p>
             <w:pPr>
-              <w:spacing w:after="0" w:line="240"/>
-            </w:pPr>
-            <w:r>
-              <w:rPr>
-                <w:rFonts w:ascii="Times New Roman" w:cs="Times New Roman" w:eastAsia="Times New Roman" w:hAnsi="Times New Roman"/>
-                <w:b/>
-                <w:bCs/>
-                <w:i w:val="false"/>
+              <w:keepNext w:val="0"/>
+              <w:keepLines w:val="0"/>
+              <w:spacing w:after="20" w:line="240" w:before="0"/>
+            </w:pPr>
+            <w:r>
+              <w:rPr>
+                <w:rFonts w:ascii="Times New Roman" w:cs="Times New Roman" w:eastAsia="Times New Roman" w:hAnsi="Times New Roman"/>
+                <w:b/>
+                <w:bCs/>
+                <w:i w:val="0"/>
                 <w:iCs w:val="false"/>
-                <w:color w:val="000000"/>
-                <w:sz w:val="22"/>
+                <w:color w:val="323539"/>
+                <w:sz w:val="16"/>
                 <w:szCs w:val="22"/>
               </w:rPr>
               <w:t xml:space="preserve">{{СРОК_ОТВЕТА_НА_ЗАПРОС}}</w:t>
@@ -1938,14 +2170,18 @@
           </w:tcPr>
           <w:p>
             <w:pPr>
-              <w:spacing w:after="0" w:line="240"/>
-            </w:pPr>
-            <w:r>
-              <w:rPr>
-                <w:rFonts w:ascii="Times New Roman" w:cs="Times New Roman" w:eastAsia="Times New Roman" w:hAnsi="Times New Roman"/>
-                <w:b w:val="false"/>
-                <w:bCs w:val="false"/>
-                <w:sz w:val="22"/>
+              <w:keepNext w:val="0"/>
+              <w:keepLines w:val="0"/>
+              <w:spacing w:after="20" w:line="240" w:before="0"/>
+            </w:pPr>
+            <w:r>
+              <w:rPr>
+                <w:rFonts w:ascii="Times New Roman" w:cs="Times New Roman" w:eastAsia="Times New Roman" w:hAnsi="Times New Roman"/>
+                <w:b w:val="false"/>
+                <w:bCs w:val="false"/>
+                <w:i w:val="0"/>
+                <w:color w:val="323539"/>
+                <w:sz w:val="16"/>
                 <w:szCs w:val="22"/>
               </w:rPr>
               <w:t xml:space="preserve">Дата, до которой вы просите ответить. Назначаете сами, разумный рабочий срок; законом срок ответа на такой запрос не установлен</w:t>
@@ -1964,14 +2200,18 @@
           </w:tcPr>
           <w:p>
             <w:pPr>
-              <w:spacing w:after="0" w:line="240"/>
-            </w:pPr>
-            <w:r>
-              <w:rPr>
-                <w:rFonts w:ascii="Times New Roman" w:cs="Times New Roman" w:eastAsia="Times New Roman" w:hAnsi="Times New Roman"/>
-                <w:b w:val="false"/>
-                <w:bCs w:val="false"/>
-                <w:sz w:val="22"/>
+              <w:keepNext w:val="0"/>
+              <w:keepLines w:val="0"/>
+              <w:spacing w:after="20" w:line="240" w:before="0"/>
+            </w:pPr>
+            <w:r>
+              <w:rPr>
+                <w:rFonts w:ascii="Times New Roman" w:cs="Times New Roman" w:eastAsia="Times New Roman" w:hAnsi="Times New Roman"/>
+                <w:b w:val="false"/>
+                <w:bCs w:val="false"/>
+                <w:i w:val="0"/>
+                <w:color w:val="323539"/>
+                <w:sz w:val="16"/>
                 <w:szCs w:val="22"/>
               </w:rPr>
               <w:t xml:space="preserve">ваш календарь сделки</w:t>
@@ -1992,17 +2232,19 @@
           </w:tcPr>
           <w:p>
             <w:pPr>
-              <w:spacing w:after="0" w:line="240"/>
-            </w:pPr>
-            <w:r>
-              <w:rPr>
-                <w:rFonts w:ascii="Times New Roman" w:cs="Times New Roman" w:eastAsia="Times New Roman" w:hAnsi="Times New Roman"/>
-                <w:b/>
-                <w:bCs/>
-                <w:i w:val="false"/>
+              <w:keepNext w:val="0"/>
+              <w:keepLines w:val="0"/>
+              <w:spacing w:after="20" w:line="240" w:before="0"/>
+            </w:pPr>
+            <w:r>
+              <w:rPr>
+                <w:rFonts w:ascii="Times New Roman" w:cs="Times New Roman" w:eastAsia="Times New Roman" w:hAnsi="Times New Roman"/>
+                <w:b/>
+                <w:bCs/>
+                <w:i w:val="0"/>
                 <w:iCs w:val="false"/>
-                <w:color w:val="000000"/>
-                <w:sz w:val="22"/>
+                <w:color w:val="323539"/>
+                <w:sz w:val="16"/>
                 <w:szCs w:val="22"/>
               </w:rPr>
               <w:t xml:space="preserve">{{АДРЕС_ДЛЯ_ОТВЕТА}}</w:t>
@@ -2012,7 +2254,9 @@
                 <w:rFonts w:ascii="Times New Roman" w:cs="Times New Roman" w:eastAsia="Times New Roman" w:hAnsi="Times New Roman"/>
                 <w:b w:val="false"/>
                 <w:bCs w:val="false"/>
-                <w:sz w:val="22"/>
+                <w:i w:val="0"/>
+                <w:color w:val="323539"/>
+                <w:sz w:val="16"/>
                 <w:szCs w:val="22"/>
               </w:rPr>
               <w:t xml:space="preserve">, </w:t>
@@ -2022,10 +2266,10 @@
                 <w:rFonts w:ascii="Times New Roman" w:cs="Times New Roman" w:eastAsia="Times New Roman" w:hAnsi="Times New Roman"/>
                 <w:b/>
                 <w:bCs/>
-                <w:i w:val="false"/>
+                <w:i w:val="0"/>
                 <w:iCs w:val="false"/>
-                <w:color w:val="000000"/>
-                <w:sz w:val="22"/>
+                <w:color w:val="323539"/>
+                <w:sz w:val="16"/>
                 <w:szCs w:val="22"/>
               </w:rPr>
               <w:t xml:space="preserve">{{ЭЛЕКТРОННАЯ_ПОЧТА}}</w:t>
@@ -2044,14 +2288,18 @@
           </w:tcPr>
           <w:p>
             <w:pPr>
-              <w:spacing w:after="0" w:line="240"/>
-            </w:pPr>
-            <w:r>
-              <w:rPr>
-                <w:rFonts w:ascii="Times New Roman" w:cs="Times New Roman" w:eastAsia="Times New Roman" w:hAnsi="Times New Roman"/>
-                <w:b w:val="false"/>
-                <w:bCs w:val="false"/>
-                <w:sz w:val="22"/>
+              <w:keepNext w:val="0"/>
+              <w:keepLines w:val="0"/>
+              <w:spacing w:after="20" w:line="240" w:before="0"/>
+            </w:pPr>
+            <w:r>
+              <w:rPr>
+                <w:rFonts w:ascii="Times New Roman" w:cs="Times New Roman" w:eastAsia="Times New Roman" w:hAnsi="Times New Roman"/>
+                <w:b w:val="false"/>
+                <w:bCs w:val="false"/>
+                <w:i w:val="0"/>
+                <w:color w:val="323539"/>
+                <w:sz w:val="16"/>
                 <w:szCs w:val="22"/>
               </w:rPr>
               <w:t xml:space="preserve">Куда направить ответ: почтовый адрес и электронная почта, согласованная сторонами для обмена документами</w:t>
@@ -2070,14 +2318,18 @@
           </w:tcPr>
           <w:p>
             <w:pPr>
-              <w:spacing w:after="0" w:line="240"/>
-            </w:pPr>
-            <w:r>
-              <w:rPr>
-                <w:rFonts w:ascii="Times New Roman" w:cs="Times New Roman" w:eastAsia="Times New Roman" w:hAnsi="Times New Roman"/>
-                <w:b w:val="false"/>
-                <w:bCs w:val="false"/>
-                <w:sz w:val="22"/>
+              <w:keepNext w:val="0"/>
+              <w:keepLines w:val="0"/>
+              <w:spacing w:after="20" w:line="240" w:before="0"/>
+            </w:pPr>
+            <w:r>
+              <w:rPr>
+                <w:rFonts w:ascii="Times New Roman" w:cs="Times New Roman" w:eastAsia="Times New Roman" w:hAnsi="Times New Roman"/>
+                <w:b w:val="false"/>
+                <w:bCs w:val="false"/>
+                <w:i w:val="0"/>
+                <w:color w:val="323539"/>
+                <w:sz w:val="16"/>
                 <w:szCs w:val="22"/>
               </w:rPr>
               <w:t xml:space="preserve">ваши рабочие контакты, договор</w:t>
@@ -2098,17 +2350,19 @@
           </w:tcPr>
           <w:p>
             <w:pPr>
-              <w:spacing w:after="0" w:line="240"/>
-            </w:pPr>
-            <w:r>
-              <w:rPr>
-                <w:rFonts w:ascii="Times New Roman" w:cs="Times New Roman" w:eastAsia="Times New Roman" w:hAnsi="Times New Roman"/>
-                <w:b/>
-                <w:bCs/>
-                <w:i w:val="false"/>
+              <w:keepNext w:val="0"/>
+              <w:keepLines w:val="0"/>
+              <w:spacing w:after="20" w:line="240" w:before="0"/>
+            </w:pPr>
+            <w:r>
+              <w:rPr>
+                <w:rFonts w:ascii="Times New Roman" w:cs="Times New Roman" w:eastAsia="Times New Roman" w:hAnsi="Times New Roman"/>
+                <w:b/>
+                <w:bCs/>
+                <w:i w:val="0"/>
                 <w:iCs w:val="false"/>
-                <w:color w:val="000000"/>
-                <w:sz w:val="22"/>
+                <w:color w:val="323539"/>
+                <w:sz w:val="16"/>
                 <w:szCs w:val="22"/>
               </w:rPr>
               <w:t xml:space="preserve">{{НОМЕР_ДДУ}}</w:t>
@@ -2118,7 +2372,9 @@
                 <w:rFonts w:ascii="Times New Roman" w:cs="Times New Roman" w:eastAsia="Times New Roman" w:hAnsi="Times New Roman"/>
                 <w:b w:val="false"/>
                 <w:bCs w:val="false"/>
-                <w:sz w:val="22"/>
+                <w:i w:val="0"/>
+                <w:color w:val="323539"/>
+                <w:sz w:val="16"/>
                 <w:szCs w:val="22"/>
               </w:rPr>
               <w:t xml:space="preserve">, </w:t>
@@ -2128,10 +2384,10 @@
                 <w:rFonts w:ascii="Times New Roman" w:cs="Times New Roman" w:eastAsia="Times New Roman" w:hAnsi="Times New Roman"/>
                 <w:b/>
                 <w:bCs/>
-                <w:i w:val="false"/>
+                <w:i w:val="0"/>
                 <w:iCs w:val="false"/>
-                <w:color w:val="000000"/>
-                <w:sz w:val="22"/>
+                <w:color w:val="323539"/>
+                <w:sz w:val="16"/>
                 <w:szCs w:val="22"/>
               </w:rPr>
               <w:t xml:space="preserve">{{ДАТА_ДДУ}}</w:t>
@@ -2150,14 +2406,18 @@
           </w:tcPr>
           <w:p>
             <w:pPr>
-              <w:spacing w:after="0" w:line="240"/>
-            </w:pPr>
-            <w:r>
-              <w:rPr>
-                <w:rFonts w:ascii="Times New Roman" w:cs="Times New Roman" w:eastAsia="Times New Roman" w:hAnsi="Times New Roman"/>
-                <w:b w:val="false"/>
-                <w:bCs w:val="false"/>
-                <w:sz w:val="22"/>
+              <w:keepNext w:val="0"/>
+              <w:keepLines w:val="0"/>
+              <w:spacing w:after="20" w:line="240" w:before="0"/>
+            </w:pPr>
+            <w:r>
+              <w:rPr>
+                <w:rFonts w:ascii="Times New Roman" w:cs="Times New Roman" w:eastAsia="Times New Roman" w:hAnsi="Times New Roman"/>
+                <w:b w:val="false"/>
+                <w:bCs w:val="false"/>
+                <w:i w:val="0"/>
+                <w:color w:val="323539"/>
+                <w:sz w:val="16"/>
                 <w:szCs w:val="22"/>
               </w:rPr>
               <w:t xml:space="preserve">Реквизиты договора участия в долевом строительстве, права по которому вам предлагают</w:t>
@@ -2176,14 +2436,18 @@
           </w:tcPr>
           <w:p>
             <w:pPr>
-              <w:spacing w:after="0" w:line="240"/>
-            </w:pPr>
-            <w:r>
-              <w:rPr>
-                <w:rFonts w:ascii="Times New Roman" w:cs="Times New Roman" w:eastAsia="Times New Roman" w:hAnsi="Times New Roman"/>
-                <w:b w:val="false"/>
-                <w:bCs w:val="false"/>
-                <w:sz w:val="22"/>
+              <w:keepNext w:val="0"/>
+              <w:keepLines w:val="0"/>
+              <w:spacing w:after="20" w:line="240" w:before="0"/>
+            </w:pPr>
+            <w:r>
+              <w:rPr>
+                <w:rFonts w:ascii="Times New Roman" w:cs="Times New Roman" w:eastAsia="Times New Roman" w:hAnsi="Times New Roman"/>
+                <w:b w:val="false"/>
+                <w:bCs w:val="false"/>
+                <w:i w:val="0"/>
+                <w:color w:val="323539"/>
+                <w:sz w:val="16"/>
                 <w:szCs w:val="22"/>
               </w:rPr>
               <w:t xml:space="preserve">сам ДДУ; регистрация проверяется по выписке ЕГРН на земельный участок</w:t>
@@ -2204,17 +2468,19 @@
           </w:tcPr>
           <w:p>
             <w:pPr>
-              <w:spacing w:after="0" w:line="240"/>
-            </w:pPr>
-            <w:r>
-              <w:rPr>
-                <w:rFonts w:ascii="Times New Roman" w:cs="Times New Roman" w:eastAsia="Times New Roman" w:hAnsi="Times New Roman"/>
-                <w:b/>
-                <w:bCs/>
-                <w:i w:val="false"/>
+              <w:keepNext w:val="0"/>
+              <w:keepLines w:val="0"/>
+              <w:spacing w:after="20" w:line="240" w:before="0"/>
+            </w:pPr>
+            <w:r>
+              <w:rPr>
+                <w:rFonts w:ascii="Times New Roman" w:cs="Times New Roman" w:eastAsia="Times New Roman" w:hAnsi="Times New Roman"/>
+                <w:b/>
+                <w:bCs/>
+                <w:i w:val="0"/>
                 <w:iCs w:val="false"/>
-                <w:color w:val="000000"/>
-                <w:sz w:val="22"/>
+                <w:color w:val="323539"/>
+                <w:sz w:val="16"/>
                 <w:szCs w:val="22"/>
               </w:rPr>
               <w:t xml:space="preserve">{{ОПИСАНИЕ_ОБЪЕКТА_ДОЛЕВОГО_СТРОИТЕЛЬСТВА}}</w:t>
@@ -2233,14 +2499,18 @@
           </w:tcPr>
           <w:p>
             <w:pPr>
-              <w:spacing w:after="0" w:line="240"/>
-            </w:pPr>
-            <w:r>
-              <w:rPr>
-                <w:rFonts w:ascii="Times New Roman" w:cs="Times New Roman" w:eastAsia="Times New Roman" w:hAnsi="Times New Roman"/>
-                <w:b w:val="false"/>
-                <w:bCs w:val="false"/>
-                <w:sz w:val="22"/>
+              <w:keepNext w:val="0"/>
+              <w:keepLines w:val="0"/>
+              <w:spacing w:after="20" w:line="240" w:before="0"/>
+            </w:pPr>
+            <w:r>
+              <w:rPr>
+                <w:rFonts w:ascii="Times New Roman" w:cs="Times New Roman" w:eastAsia="Times New Roman" w:hAnsi="Times New Roman"/>
+                <w:b w:val="false"/>
+                <w:bCs w:val="false"/>
+                <w:i w:val="0"/>
+                <w:color w:val="323539"/>
+                <w:sz w:val="16"/>
                 <w:szCs w:val="22"/>
               </w:rPr>
               <w:t xml:space="preserve">Квартира или иной объект по ДДУ: строительный номер, площадь, этаж — как в договоре</w:t>
@@ -2259,14 +2529,18 @@
           </w:tcPr>
           <w:p>
             <w:pPr>
-              <w:spacing w:after="0" w:line="240"/>
-            </w:pPr>
-            <w:r>
-              <w:rPr>
-                <w:rFonts w:ascii="Times New Roman" w:cs="Times New Roman" w:eastAsia="Times New Roman" w:hAnsi="Times New Roman"/>
-                <w:b w:val="false"/>
-                <w:bCs w:val="false"/>
-                <w:sz w:val="22"/>
+              <w:keepNext w:val="0"/>
+              <w:keepLines w:val="0"/>
+              <w:spacing w:after="20" w:line="240" w:before="0"/>
+            </w:pPr>
+            <w:r>
+              <w:rPr>
+                <w:rFonts w:ascii="Times New Roman" w:cs="Times New Roman" w:eastAsia="Times New Roman" w:hAnsi="Times New Roman"/>
+                <w:b w:val="false"/>
+                <w:bCs w:val="false"/>
+                <w:i w:val="0"/>
+                <w:color w:val="323539"/>
+                <w:sz w:val="16"/>
                 <w:szCs w:val="22"/>
               </w:rPr>
               <w:t xml:space="preserve">предмет ДДУ, приложения к нему</w:t>
@@ -2287,17 +2561,19 @@
           </w:tcPr>
           <w:p>
             <w:pPr>
-              <w:spacing w:after="0" w:line="240"/>
-            </w:pPr>
-            <w:r>
-              <w:rPr>
-                <w:rFonts w:ascii="Times New Roman" w:cs="Times New Roman" w:eastAsia="Times New Roman" w:hAnsi="Times New Roman"/>
-                <w:b/>
-                <w:bCs/>
-                <w:i w:val="false"/>
+              <w:keepNext w:val="0"/>
+              <w:keepLines w:val="0"/>
+              <w:spacing w:after="20" w:line="240" w:before="0"/>
+            </w:pPr>
+            <w:r>
+              <w:rPr>
+                <w:rFonts w:ascii="Times New Roman" w:cs="Times New Roman" w:eastAsia="Times New Roman" w:hAnsi="Times New Roman"/>
+                <w:b/>
+                <w:bCs/>
+                <w:i w:val="0"/>
                 <w:iCs w:val="false"/>
-                <w:color w:val="000000"/>
-                <w:sz w:val="22"/>
+                <w:color w:val="323539"/>
+                <w:sz w:val="16"/>
                 <w:szCs w:val="22"/>
               </w:rPr>
               <w:t xml:space="preserve">{{НАИМЕНОВАНИЕ_БАНКА}}</w:t>
@@ -2307,7 +2583,9 @@
                 <w:rFonts w:ascii="Times New Roman" w:cs="Times New Roman" w:eastAsia="Times New Roman" w:hAnsi="Times New Roman"/>
                 <w:b w:val="false"/>
                 <w:bCs w:val="false"/>
-                <w:sz w:val="22"/>
+                <w:i w:val="0"/>
+                <w:color w:val="323539"/>
+                <w:sz w:val="16"/>
                 <w:szCs w:val="22"/>
               </w:rPr>
               <w:t xml:space="preserve">, </w:t>
@@ -2317,10 +2595,10 @@
                 <w:rFonts w:ascii="Times New Roman" w:cs="Times New Roman" w:eastAsia="Times New Roman" w:hAnsi="Times New Roman"/>
                 <w:b/>
                 <w:bCs/>
-                <w:i w:val="false"/>
+                <w:i w:val="0"/>
                 <w:iCs w:val="false"/>
-                <w:color w:val="000000"/>
-                <w:sz w:val="22"/>
+                <w:color w:val="323539"/>
+                <w:sz w:val="16"/>
                 <w:szCs w:val="22"/>
               </w:rPr>
               <w:t xml:space="preserve">{{НАИМЕНОВАНИЕ_БАНКА_ЕСЛИ_ИЗВЕСТЕН}}</w:t>
@@ -2339,14 +2617,18 @@
           </w:tcPr>
           <w:p>
             <w:pPr>
-              <w:spacing w:after="0" w:line="240"/>
-            </w:pPr>
-            <w:r>
-              <w:rPr>
-                <w:rFonts w:ascii="Times New Roman" w:cs="Times New Roman" w:eastAsia="Times New Roman" w:hAnsi="Times New Roman"/>
-                <w:b w:val="false"/>
-                <w:bCs w:val="false"/>
-                <w:sz w:val="22"/>
+              <w:keepNext w:val="0"/>
+              <w:keepLines w:val="0"/>
+              <w:spacing w:after="20" w:line="240" w:before="0"/>
+            </w:pPr>
+            <w:r>
+              <w:rPr>
+                <w:rFonts w:ascii="Times New Roman" w:cs="Times New Roman" w:eastAsia="Times New Roman" w:hAnsi="Times New Roman"/>
+                <w:b w:val="false"/>
+                <w:bCs w:val="false"/>
+                <w:i w:val="0"/>
+                <w:color w:val="323539"/>
+                <w:sz w:val="16"/>
                 <w:szCs w:val="22"/>
               </w:rPr>
               <w:t xml:space="preserve">Банк, в котором открыт счёт эскроу по передаваемому ДДУ. Неизвестен — поле в запросе оставить пустым и спросить в пункте 1 запроса</w:t>
@@ -2365,14 +2647,18 @@
           </w:tcPr>
           <w:p>
             <w:pPr>
-              <w:spacing w:after="0" w:line="240"/>
-            </w:pPr>
-            <w:r>
-              <w:rPr>
-                <w:rFonts w:ascii="Times New Roman" w:cs="Times New Roman" w:eastAsia="Times New Roman" w:hAnsi="Times New Roman"/>
-                <w:b w:val="false"/>
-                <w:bCs w:val="false"/>
-                <w:sz w:val="22"/>
+              <w:keepNext w:val="0"/>
+              <w:keepLines w:val="0"/>
+              <w:spacing w:after="20" w:line="240" w:before="0"/>
+            </w:pPr>
+            <w:r>
+              <w:rPr>
+                <w:rFonts w:ascii="Times New Roman" w:cs="Times New Roman" w:eastAsia="Times New Roman" w:hAnsi="Times New Roman"/>
+                <w:b w:val="false"/>
+                <w:bCs w:val="false"/>
+                <w:i w:val="0"/>
+                <w:color w:val="323539"/>
+                <w:sz w:val="16"/>
                 <w:szCs w:val="22"/>
               </w:rPr>
               <w:t xml:space="preserve">ДДУ (раздел о порядке оплаты), проектная декларация</w:t>
@@ -2393,17 +2679,19 @@
           </w:tcPr>
           <w:p>
             <w:pPr>
-              <w:spacing w:after="0" w:line="240"/>
-            </w:pPr>
-            <w:r>
-              <w:rPr>
-                <w:rFonts w:ascii="Times New Roman" w:cs="Times New Roman" w:eastAsia="Times New Roman" w:hAnsi="Times New Roman"/>
-                <w:b/>
-                <w:bCs/>
-                <w:i w:val="false"/>
+              <w:keepNext w:val="0"/>
+              <w:keepLines w:val="0"/>
+              <w:spacing w:after="20" w:line="240" w:before="0"/>
+            </w:pPr>
+            <w:r>
+              <w:rPr>
+                <w:rFonts w:ascii="Times New Roman" w:cs="Times New Roman" w:eastAsia="Times New Roman" w:hAnsi="Times New Roman"/>
+                <w:b/>
+                <w:bCs/>
+                <w:i w:val="0"/>
                 <w:iCs w:val="false"/>
-                <w:color w:val="000000"/>
-                <w:sz w:val="22"/>
+                <w:color w:val="323539"/>
+                <w:sz w:val="16"/>
                 <w:szCs w:val="22"/>
               </w:rPr>
               <w:t xml:space="preserve">{{ДАТА_СПРАВКИ}}</w:t>
@@ -2422,14 +2710,18 @@
           </w:tcPr>
           <w:p>
             <w:pPr>
-              <w:spacing w:after="0" w:line="240"/>
-            </w:pPr>
-            <w:r>
-              <w:rPr>
-                <w:rFonts w:ascii="Times New Roman" w:cs="Times New Roman" w:eastAsia="Times New Roman" w:hAnsi="Times New Roman"/>
-                <w:b w:val="false"/>
-                <w:bCs w:val="false"/>
-                <w:sz w:val="22"/>
+              <w:keepNext w:val="0"/>
+              <w:keepLines w:val="0"/>
+              <w:spacing w:after="20" w:line="240" w:before="0"/>
+            </w:pPr>
+            <w:r>
+              <w:rPr>
+                <w:rFonts w:ascii="Times New Roman" w:cs="Times New Roman" w:eastAsia="Times New Roman" w:hAnsi="Times New Roman"/>
+                <w:b w:val="false"/>
+                <w:bCs w:val="false"/>
+                <w:i w:val="0"/>
+                <w:color w:val="323539"/>
+                <w:sz w:val="16"/>
                 <w:szCs w:val="22"/>
               </w:rPr>
               <w:t xml:space="preserve">Дата справки банка об оплате цены ДДУ — в формулировке пункта уступки о переданном оплаченном праве</w:t>
@@ -2448,14 +2740,18 @@
           </w:tcPr>
           <w:p>
             <w:pPr>
-              <w:spacing w:after="0" w:line="240"/>
-            </w:pPr>
-            <w:r>
-              <w:rPr>
-                <w:rFonts w:ascii="Times New Roman" w:cs="Times New Roman" w:eastAsia="Times New Roman" w:hAnsi="Times New Roman"/>
-                <w:b w:val="false"/>
-                <w:bCs w:val="false"/>
-                <w:sz w:val="22"/>
+              <w:keepNext w:val="0"/>
+              <w:keepLines w:val="0"/>
+              <w:spacing w:after="20" w:line="240" w:before="0"/>
+            </w:pPr>
+            <w:r>
+              <w:rPr>
+                <w:rFonts w:ascii="Times New Roman" w:cs="Times New Roman" w:eastAsia="Times New Roman" w:hAnsi="Times New Roman"/>
+                <w:b w:val="false"/>
+                <w:bCs w:val="false"/>
+                <w:i w:val="0"/>
+                <w:color w:val="323539"/>
+                <w:sz w:val="16"/>
                 <w:szCs w:val="22"/>
               </w:rPr>
               <w:t xml:space="preserve">сама справка (выписка) банка</w:t>
@@ -2476,17 +2772,19 @@
           </w:tcPr>
           <w:p>
             <w:pPr>
-              <w:spacing w:after="0" w:line="240"/>
-            </w:pPr>
-            <w:r>
-              <w:rPr>
-                <w:rFonts w:ascii="Times New Roman" w:cs="Times New Roman" w:eastAsia="Times New Roman" w:hAnsi="Times New Roman"/>
-                <w:b/>
-                <w:bCs/>
-                <w:i w:val="false"/>
+              <w:keepNext w:val="0"/>
+              <w:keepLines w:val="0"/>
+              <w:spacing w:after="20" w:line="240" w:before="0"/>
+            </w:pPr>
+            <w:r>
+              <w:rPr>
+                <w:rFonts w:ascii="Times New Roman" w:cs="Times New Roman" w:eastAsia="Times New Roman" w:hAnsi="Times New Roman"/>
+                <w:b/>
+                <w:bCs/>
+                <w:i w:val="0"/>
                 <w:iCs w:val="false"/>
-                <w:color w:val="000000"/>
-                <w:sz w:val="22"/>
+                <w:color w:val="323539"/>
+                <w:sz w:val="16"/>
                 <w:szCs w:val="22"/>
               </w:rPr>
               <w:t xml:space="preserve">{{ЦЕНА_РЫНКА}}</w:t>
@@ -2505,14 +2803,18 @@
           </w:tcPr>
           <w:p>
             <w:pPr>
-              <w:spacing w:after="0" w:line="240"/>
-            </w:pPr>
-            <w:r>
-              <w:rPr>
-                <w:rFonts w:ascii="Times New Roman" w:cs="Times New Roman" w:eastAsia="Times New Roman" w:hAnsi="Times New Roman"/>
-                <w:b w:val="false"/>
-                <w:bCs w:val="false"/>
-                <w:sz w:val="22"/>
+              <w:keepNext w:val="0"/>
+              <w:keepLines w:val="0"/>
+              <w:spacing w:after="20" w:line="240" w:before="0"/>
+            </w:pPr>
+            <w:r>
+              <w:rPr>
+                <w:rFonts w:ascii="Times New Roman" w:cs="Times New Roman" w:eastAsia="Times New Roman" w:hAnsi="Times New Roman"/>
+                <w:b w:val="false"/>
+                <w:bCs w:val="false"/>
+                <w:i w:val="0"/>
+                <w:color w:val="323539"/>
+                <w:sz w:val="16"/>
                 <w:szCs w:val="22"/>
               </w:rPr>
               <w:t xml:space="preserve">Реальная цена продажи такой квартиры сегодня</w:t>
@@ -2531,14 +2833,18 @@
           </w:tcPr>
           <w:p>
             <w:pPr>
-              <w:spacing w:after="0" w:line="240"/>
-            </w:pPr>
-            <w:r>
-              <w:rPr>
-                <w:rFonts w:ascii="Times New Roman" w:cs="Times New Roman" w:eastAsia="Times New Roman" w:hAnsi="Times New Roman"/>
-                <w:b w:val="false"/>
-                <w:bCs w:val="false"/>
-                <w:sz w:val="22"/>
+              <w:keepNext w:val="0"/>
+              <w:keepLines w:val="0"/>
+              <w:spacing w:after="20" w:line="240" w:before="0"/>
+            </w:pPr>
+            <w:r>
+              <w:rPr>
+                <w:rFonts w:ascii="Times New Roman" w:cs="Times New Roman" w:eastAsia="Times New Roman" w:hAnsi="Times New Roman"/>
+                <w:b w:val="false"/>
+                <w:bCs w:val="false"/>
+                <w:i w:val="0"/>
+                <w:color w:val="323539"/>
+                <w:sz w:val="16"/>
                 <w:szCs w:val="22"/>
               </w:rPr>
               <w:t xml:space="preserve">стакан предложений по дому и району, а не прайс застройщика</w:t>
@@ -2559,17 +2865,19 @@
           </w:tcPr>
           <w:p>
             <w:pPr>
-              <w:spacing w:after="0" w:line="240"/>
-            </w:pPr>
-            <w:r>
-              <w:rPr>
-                <w:rFonts w:ascii="Times New Roman" w:cs="Times New Roman" w:eastAsia="Times New Roman" w:hAnsi="Times New Roman"/>
-                <w:b/>
-                <w:bCs/>
-                <w:i w:val="false"/>
+              <w:keepNext w:val="0"/>
+              <w:keepLines w:val="0"/>
+              <w:spacing w:after="20" w:line="240" w:before="0"/>
+            </w:pPr>
+            <w:r>
+              <w:rPr>
+                <w:rFonts w:ascii="Times New Roman" w:cs="Times New Roman" w:eastAsia="Times New Roman" w:hAnsi="Times New Roman"/>
+                <w:b/>
+                <w:bCs/>
+                <w:i w:val="0"/>
                 <w:iCs w:val="false"/>
-                <w:color w:val="000000"/>
-                <w:sz w:val="22"/>
+                <w:color w:val="323539"/>
+                <w:sz w:val="16"/>
                 <w:szCs w:val="22"/>
               </w:rPr>
               <w:t xml:space="preserve">{{ЦЕНА_В_РАСЧЁТЕ}}</w:t>
@@ -2588,14 +2896,18 @@
           </w:tcPr>
           <w:p>
             <w:pPr>
-              <w:spacing w:after="0" w:line="240"/>
-            </w:pPr>
-            <w:r>
-              <w:rPr>
-                <w:rFonts w:ascii="Times New Roman" w:cs="Times New Roman" w:eastAsia="Times New Roman" w:hAnsi="Times New Roman"/>
-                <w:b w:val="false"/>
-                <w:bCs w:val="false"/>
-                <w:sz w:val="22"/>
+              <w:keepNext w:val="0"/>
+              <w:keepLines w:val="0"/>
+              <w:spacing w:after="20" w:line="240" w:before="0"/>
+            </w:pPr>
+            <w:r>
+              <w:rPr>
+                <w:rFonts w:ascii="Times New Roman" w:cs="Times New Roman" w:eastAsia="Times New Roman" w:hAnsi="Times New Roman"/>
+                <w:b w:val="false"/>
+                <w:bCs w:val="false"/>
+                <w:i w:val="0"/>
+                <w:color w:val="323539"/>
+                <w:sz w:val="16"/>
                 <w:szCs w:val="22"/>
               </w:rPr>
               <w:t xml:space="preserve">Цена метра, по которой квартиру засчитывают в счёт работ, с учётом скидки</w:t>
@@ -2614,14 +2926,18 @@
           </w:tcPr>
           <w:p>
             <w:pPr>
-              <w:spacing w:after="0" w:line="240"/>
-            </w:pPr>
-            <w:r>
-              <w:rPr>
-                <w:rFonts w:ascii="Times New Roman" w:cs="Times New Roman" w:eastAsia="Times New Roman" w:hAnsi="Times New Roman"/>
-                <w:b w:val="false"/>
-                <w:bCs w:val="false"/>
-                <w:sz w:val="22"/>
+              <w:keepNext w:val="0"/>
+              <w:keepLines w:val="0"/>
+              <w:spacing w:after="20" w:line="240" w:before="0"/>
+            </w:pPr>
+            <w:r>
+              <w:rPr>
+                <w:rFonts w:ascii="Times New Roman" w:cs="Times New Roman" w:eastAsia="Times New Roman" w:hAnsi="Times New Roman"/>
+                <w:b w:val="false"/>
+                <w:bCs w:val="false"/>
+                <w:i w:val="0"/>
+                <w:color w:val="323539"/>
+                <w:sz w:val="16"/>
                 <w:szCs w:val="22"/>
               </w:rPr>
               <w:t xml:space="preserve">предложение застройщика, проект договора</w:t>
@@ -2642,17 +2958,19 @@
           </w:tcPr>
           <w:p>
             <w:pPr>
-              <w:spacing w:after="0" w:line="240"/>
-            </w:pPr>
-            <w:r>
-              <w:rPr>
-                <w:rFonts w:ascii="Times New Roman" w:cs="Times New Roman" w:eastAsia="Times New Roman" w:hAnsi="Times New Roman"/>
-                <w:b/>
-                <w:bCs/>
-                <w:i w:val="false"/>
+              <w:keepNext w:val="0"/>
+              <w:keepLines w:val="0"/>
+              <w:spacing w:after="20" w:line="240" w:before="0"/>
+            </w:pPr>
+            <w:r>
+              <w:rPr>
+                <w:rFonts w:ascii="Times New Roman" w:cs="Times New Roman" w:eastAsia="Times New Roman" w:hAnsi="Times New Roman"/>
+                <w:b/>
+                <w:bCs/>
+                <w:i w:val="0"/>
                 <w:iCs w:val="false"/>
-                <w:color w:val="000000"/>
-                <w:sz w:val="22"/>
+                <w:color w:val="323539"/>
+                <w:sz w:val="16"/>
                 <w:szCs w:val="22"/>
               </w:rPr>
               <w:t xml:space="preserve">{{ДОЛЯ_ДЕНЬГАМИ}}</w:t>
@@ -2671,14 +2989,18 @@
           </w:tcPr>
           <w:p>
             <w:pPr>
-              <w:spacing w:after="0" w:line="240"/>
-            </w:pPr>
-            <w:r>
-              <w:rPr>
-                <w:rFonts w:ascii="Times New Roman" w:cs="Times New Roman" w:eastAsia="Times New Roman" w:hAnsi="Times New Roman"/>
-                <w:b w:val="false"/>
-                <w:bCs w:val="false"/>
-                <w:sz w:val="22"/>
+              <w:keepNext w:val="0"/>
+              <w:keepLines w:val="0"/>
+              <w:spacing w:after="20" w:line="240" w:before="0"/>
+            </w:pPr>
+            <w:r>
+              <w:rPr>
+                <w:rFonts w:ascii="Times New Roman" w:cs="Times New Roman" w:eastAsia="Times New Roman" w:hAnsi="Times New Roman"/>
+                <w:b w:val="false"/>
+                <w:bCs w:val="false"/>
+                <w:i w:val="0"/>
+                <w:color w:val="323539"/>
+                <w:sz w:val="16"/>
                 <w:szCs w:val="22"/>
               </w:rPr>
               <w:t xml:space="preserve">Согласованная денежная часть расчёта: метрами — не более остальной доли</w:t>
@@ -2697,14 +3019,18 @@
           </w:tcPr>
           <w:p>
             <w:pPr>
-              <w:spacing w:after="0" w:line="240"/>
-            </w:pPr>
-            <w:r>
-              <w:rPr>
-                <w:rFonts w:ascii="Times New Roman" w:cs="Times New Roman" w:eastAsia="Times New Roman" w:hAnsi="Times New Roman"/>
-                <w:b w:val="false"/>
-                <w:bCs w:val="false"/>
-                <w:sz w:val="22"/>
+              <w:keepNext w:val="0"/>
+              <w:keepLines w:val="0"/>
+              <w:spacing w:after="20" w:line="240" w:before="0"/>
+            </w:pPr>
+            <w:r>
+              <w:rPr>
+                <w:rFonts w:ascii="Times New Roman" w:cs="Times New Roman" w:eastAsia="Times New Roman" w:hAnsi="Times New Roman"/>
+                <w:b w:val="false"/>
+                <w:bCs w:val="false"/>
+                <w:i w:val="0"/>
+                <w:color w:val="323539"/>
+                <w:sz w:val="16"/>
                 <w:szCs w:val="22"/>
               </w:rPr>
               <w:t xml:space="preserve">ваши переговоры; итог записывается в договор подряда</w:t>
@@ -2715,20 +3041,22 @@
     </w:tbl>
     <w:p>
       <w:pPr>
-        <w:spacing w:after="120" w:line="276"/>
+        <w:spacing w:after="60" w:line="276" w:before="0"/>
       </w:pPr>
     </w:p>
     <w:p>
       <w:pPr>
         <w:pStyle w:val="Heading2"/>
         <w:keepNext/>
-        <w:spacing w:after="120" w:before="260"/>
+        <w:spacing w:after="60" w:before="0"/>
       </w:pPr>
       <w:r>
         <w:rPr>
           <w:rFonts w:ascii="Times New Roman" w:cs="Times New Roman" w:eastAsia="Times New Roman" w:hAnsi="Times New Roman"/>
           <w:b/>
           <w:bCs/>
+          <w:i w:val="0"/>
+          <w:color w:val="323539"/>
           <w:sz w:val="26"/>
           <w:szCs w:val="26"/>
         </w:rPr>
@@ -2737,11 +3065,13 @@
     </w:p>
     <w:p>
       <w:pPr>
-        <w:spacing w:after="120" w:line="276"/>
+        <w:spacing w:after="60" w:line="276" w:before="0"/>
       </w:pPr>
       <w:r>
         <w:rPr>
           <w:rFonts w:ascii="Times New Roman" w:cs="Times New Roman" w:eastAsia="Times New Roman" w:hAnsi="Times New Roman"/>
+          <w:i w:val="0"/>
+          <w:color w:val="323539"/>
           <w:sz w:val="24"/>
           <w:szCs w:val="24"/>
         </w:rPr>
@@ -2750,7 +3080,7 @@
     </w:p>
     <w:sectPr>
       <w:pgSz w:w="11906" w:h="16838" w:orient="portrait"/>
-      <w:pgMar w:top="1133" w:right="850" w:bottom="1133" w:left="1417" w:header="708" w:footer="708" w:gutter="0"/>
+      <w:pgMar w:top="510" w:right="850" w:bottom="510" w:left="1417" w:header="708" w:footer="708" w:gutter="0"/>
       <w:pgNumType/>
       <w:docGrid w:linePitch="360"/>
     </w:sectPr>
@@ -2967,6 +3297,8 @@
     <w:next w:val="Normal"/>
     <w:qFormat/>
     <w:rPr>
+      <w:i w:val="0"/>
+      <w:color w:val="323539"/>
       <w:sz w:val="56"/>
       <w:szCs w:val="56"/>
     </w:rPr>
@@ -2977,7 +3309,8 @@
     <w:next w:val="Normal"/>
     <w:qFormat/>
     <w:rPr>
-      <w:color w:val="2E74B5"/>
+      <w:i w:val="0"/>
+      <w:color w:val="323539"/>
       <w:sz w:val="32"/>
       <w:szCs w:val="32"/>
     </w:rPr>
@@ -2988,7 +3321,8 @@
     <w:next w:val="Normal"/>
     <w:qFormat/>
     <w:rPr>
-      <w:color w:val="2E74B5"/>
+      <w:i w:val="0"/>
+      <w:color w:val="323539"/>
       <w:sz w:val="26"/>
       <w:szCs w:val="26"/>
     </w:rPr>
@@ -2999,7 +3333,8 @@
     <w:next w:val="Normal"/>
     <w:qFormat/>
     <w:rPr>
-      <w:color w:val="1F4D78"/>
+      <w:i w:val="0"/>
+      <w:color w:val="323539"/>
       <w:sz w:val="24"/>
       <w:szCs w:val="24"/>
     </w:rPr>
@@ -3010,9 +3345,9 @@
     <w:next w:val="Normal"/>
     <w:qFormat/>
     <w:rPr>
-      <w:i/>
+      <w:i w:val="0"/>
       <w:iCs/>
-      <w:color w:val="2E74B5"/>
+      <w:color w:val="323539"/>
     </w:rPr>
   </w:style>
   <w:style w:type="paragraph" w:styleId="Heading5">
@@ -3021,7 +3356,8 @@
     <w:next w:val="Normal"/>
     <w:qFormat/>
     <w:rPr>
-      <w:color w:val="2E74B5"/>
+      <w:i w:val="0"/>
+      <w:color w:val="323539"/>
     </w:rPr>
   </w:style>
   <w:style w:type="paragraph" w:styleId="Heading6">
@@ -3030,7 +3366,8 @@
     <w:next w:val="Normal"/>
     <w:qFormat/>
     <w:rPr>
-      <w:color w:val="1F4D78"/>
+      <w:i w:val="0"/>
+      <w:color w:val="323539"/>
     </w:rPr>
   </w:style>
   <w:style w:type="paragraph" w:styleId="Strong">
@@ -3041,12 +3378,18 @@
     <w:rPr>
       <w:b/>
       <w:bCs/>
+      <w:i w:val="0"/>
+      <w:color w:val="323539"/>
     </w:rPr>
   </w:style>
   <w:style w:type="paragraph" w:styleId="ListParagraph">
     <w:name w:val="List Paragraph"/>
     <w:basedOn w:val="Normal"/>
     <w:qFormat/>
+    <w:rPr>
+      <w:i w:val="0"/>
+      <w:color w:val="323539"/>
+    </w:rPr>
   </w:style>
   <w:style w:type="character" w:styleId="Hyperlink">
     <w:name w:val="Hyperlink"/>
@@ -3079,6 +3422,8 @@
       <w:spacing w:after="0" w:line="240" w:lineRule="auto"/>
     </w:pPr>
     <w:rPr>
+      <w:i w:val="0"/>
+      <w:color w:val="323539"/>
       <w:sz w:val="20"/>
       <w:szCs w:val="20"/>
     </w:rPr>
@@ -3116,6 +3461,8 @@
       <w:spacing w:after="0" w:line="240" w:lineRule="auto"/>
     </w:pPr>
     <w:rPr>
+      <w:i w:val="0"/>
+      <w:color w:val="323539"/>
       <w:sz w:val="20"/>
       <w:szCs w:val="20"/>
     </w:rPr>

</xml_diff>